<commit_message>
Add AI feedback and flexible grading with Gemini
</commit_message>
<xml_diff>
--- a/docs/projectupdate.docx
+++ b/docs/projectupdate.docx
@@ -3,18 +3,6 @@
 <w:document xmlns:wpc="http://schemas.microsoft.com/office/word/2010/wordprocessingCanvas" xmlns:cx="http://schemas.microsoft.com/office/drawing/2014/chartex" xmlns:cx1="http://schemas.microsoft.com/office/drawing/2015/9/8/chartex" xmlns:cx2="http://schemas.microsoft.com/office/drawing/2015/10/21/chartex" xmlns:cx3="http://schemas.microsoft.com/office/drawing/2016/5/9/chartex" xmlns:cx4="http://schemas.microsoft.com/office/drawing/2016/5/10/chartex" xmlns:cx5="http://schemas.microsoft.com/office/drawing/2016/5/11/chartex" xmlns:cx6="http://schemas.microsoft.com/office/drawing/2016/5/12/chartex" xmlns:cx7="http://schemas.microsoft.com/office/drawing/2016/5/13/chartex" xmlns:cx8="http://schemas.microsoft.com/office/drawing/2016/5/14/chartex" xmlns:mc="http://schemas.openxmlformats.org/markup-compatibility/2006" xmlns:aink="http://schemas.microsoft.com/office/drawing/2016/ink" xmlns:am3d="http://schemas.microsoft.com/office/drawing/2017/model3d" xmlns:o="urn:schemas-microsoft-com:office:office" xmlns:oel="http://schemas.microsoft.com/office/2019/extlst" xmlns:r="http://schemas.openxmlformats.org/officeDocument/2006/relationships" xmlns:m="http://schemas.openxmlformats.org/officeDocument/2006/math" xmlns:v="urn:schemas-microsoft-com:vml" xmlns:wp14="http://schemas.microsoft.com/office/word/2010/wordprocessingDrawing" xmlns:wp="http://schemas.openxmlformats.org/drawingml/2006/wordprocessingDrawing" xmlns:w10="urn:schemas-microsoft-com:office:word" xmlns:w="http://schemas.openxmlformats.org/wordprocessingml/2006/main" xmlns:w14="http://schemas.microsoft.com/office/word/2010/wordml" xmlns:w15="http://schemas.microsoft.com/office/word/2012/wordml" xmlns:w16cex="http://schemas.microsoft.com/office/word/2018/wordml/cex" xmlns:w16cid="http://schemas.microsoft.com/office/word/2016/wordml/cid" xmlns:w16="http://schemas.microsoft.com/office/word/2018/wordml" xmlns:w16du="http://schemas.microsoft.com/office/word/2023/wordml/word16du" xmlns:w16sdtdh="http://schemas.microsoft.com/office/word/2020/wordml/sdtdatahash" xmlns:w16sdtfl="http://schemas.microsoft.com/office/word/2024/wordml/sdtformatlock" xmlns:w16se="http://schemas.microsoft.com/office/word/2015/wordml/symex" xmlns:wpg="http://schemas.microsoft.com/office/word/2010/wordprocessingGroup" xmlns:wpi="http://schemas.microsoft.com/office/word/2010/wordprocessingInk" xmlns:wne="http://schemas.microsoft.com/office/word/2006/wordml" xmlns:wps="http://schemas.microsoft.com/office/word/2010/wordprocessingShape" mc:Ignorable="w14 w15 w16se w16cid w16 w16cex w16sdtdh w16sdtfl w16du wp14">
   <w:body>
     <w:p>
-      <w:r>
-        <w:t>I appreciate that you want to understand the “why” behind each step—that’s exactly what makes a great software engineer. Let’s recap everything we’ve built so far, why we did it, and how it fits into the overall system.</w:t>
-      </w:r>
-    </w:p>
-    <w:p>
-      <w:r>
-        <w:pict w14:anchorId="136E8A90">
-          <v:rect id="_x0000_i1043" style="width:0;height:.75pt" o:hralign="center" o:hrstd="t" o:hr="t" fillcolor="#a0a0a0" stroked="f"/>
-        </w:pict>
-      </w:r>
-    </w:p>
-    <w:p>
       <w:pPr>
         <w:rPr>
           <w:b/>
@@ -26,7 +14,7 @@
           <w:b/>
           <w:bCs/>
         </w:rPr>
-        <w:t>What We’ve Accomplished (Features 1 &amp; 2)</w:t>
+        <w:t>Project Status &amp; Team Responsibilities</w:t>
       </w:r>
     </w:p>
     <w:p>
@@ -41,55 +29,137 @@
           <w:b/>
           <w:bCs/>
         </w:rPr>
-        <w:t>1. Django Project Setup</w:t>
-      </w:r>
-    </w:p>
-    <w:p>
-      <w:pPr>
-        <w:numPr>
-          <w:ilvl w:val="0"/>
-          <w:numId w:val="1"/>
-        </w:numPr>
-      </w:pPr>
-      <w:r>
+        <w:t>What I Have Completed (Lead Backend)</w:t>
+      </w:r>
+    </w:p>
+    <w:p>
+      <w:r>
+        <w:t>I have built the core backend of the AI</w:t>
+      </w:r>
+      <w:r>
+        <w:noBreakHyphen/>
+        <w:t>assisted programming assignment grading system. Below are the finished features:</w:t>
+      </w:r>
+    </w:p>
+    <w:p>
+      <w:pPr>
         <w:rPr>
           <w:b/>
           <w:bCs/>
         </w:rPr>
-        <w:t>Created a Django project</w:t>
-      </w:r>
-      <w:r>
-        <w:t xml:space="preserve"> (grading_system) and an </w:t>
-      </w:r>
-      <w:proofErr w:type="gramStart"/>
-      <w:r>
-        <w:t>app accounts</w:t>
-      </w:r>
-      <w:proofErr w:type="gramEnd"/>
-      <w:r>
-        <w:t> for user management.</w:t>
-      </w:r>
-    </w:p>
-    <w:p>
-      <w:pPr>
-        <w:numPr>
-          <w:ilvl w:val="0"/>
-          <w:numId w:val="1"/>
-        </w:numPr>
       </w:pPr>
       <w:r>
         <w:rPr>
           <w:b/>
           <w:bCs/>
         </w:rPr>
-        <w:t>Why</w:t>
-      </w:r>
-      <w:r>
-        <w:t>: This gives us a structured environment with a built</w:t>
+        <w:t>1. User Authentication</w:t>
+      </w:r>
+    </w:p>
+    <w:p>
+      <w:pPr>
+        <w:numPr>
+          <w:ilvl w:val="0"/>
+          <w:numId w:val="12"/>
+        </w:numPr>
+      </w:pPr>
+      <w:r>
+        <w:t>Custom User model with role field (student / lecturer).</w:t>
+      </w:r>
+    </w:p>
+    <w:p>
+      <w:pPr>
+        <w:numPr>
+          <w:ilvl w:val="0"/>
+          <w:numId w:val="12"/>
+        </w:numPr>
+      </w:pPr>
+      <w:r>
+        <w:t>JWT</w:t>
       </w:r>
       <w:r>
         <w:noBreakHyphen/>
-        <w:t>in database (SQLite), admin panel, and all the tools we need to build a web backend.</w:t>
+        <w:t>based authentication using </w:t>
+      </w:r>
+      <w:proofErr w:type="spellStart"/>
+      <w:r>
+        <w:t>djangorestframework-simplejwt</w:t>
+      </w:r>
+      <w:proofErr w:type="spellEnd"/>
+      <w:r>
+        <w:t>:</w:t>
+      </w:r>
+    </w:p>
+    <w:p>
+      <w:pPr>
+        <w:numPr>
+          <w:ilvl w:val="1"/>
+          <w:numId w:val="12"/>
+        </w:numPr>
+      </w:pPr>
+      <w:r>
+        <w:t>POST /</w:t>
+      </w:r>
+      <w:proofErr w:type="spellStart"/>
+      <w:r>
+        <w:t>api</w:t>
+      </w:r>
+      <w:proofErr w:type="spellEnd"/>
+      <w:r>
+        <w:t>/auth/register/ – register with role.</w:t>
+      </w:r>
+    </w:p>
+    <w:p>
+      <w:pPr>
+        <w:numPr>
+          <w:ilvl w:val="1"/>
+          <w:numId w:val="12"/>
+        </w:numPr>
+      </w:pPr>
+      <w:r>
+        <w:t>POST /</w:t>
+      </w:r>
+      <w:proofErr w:type="spellStart"/>
+      <w:r>
+        <w:t>api</w:t>
+      </w:r>
+      <w:proofErr w:type="spellEnd"/>
+      <w:r>
+        <w:t>/auth/login/ – obtain access &amp; refresh tokens.</w:t>
+      </w:r>
+    </w:p>
+    <w:p>
+      <w:pPr>
+        <w:numPr>
+          <w:ilvl w:val="1"/>
+          <w:numId w:val="12"/>
+        </w:numPr>
+      </w:pPr>
+      <w:r>
+        <w:t>POST /</w:t>
+      </w:r>
+      <w:proofErr w:type="spellStart"/>
+      <w:r>
+        <w:t>api</w:t>
+      </w:r>
+      <w:proofErr w:type="spellEnd"/>
+      <w:r>
+        <w:t>/auth/token/refresh/ – refresh expired access token.</w:t>
+      </w:r>
+    </w:p>
+    <w:p>
+      <w:pPr>
+        <w:numPr>
+          <w:ilvl w:val="0"/>
+          <w:numId w:val="12"/>
+        </w:numPr>
+      </w:pPr>
+      <w:r>
+        <w:t>Role</w:t>
+      </w:r>
+      <w:r>
+        <w:noBreakHyphen/>
+        <w:t>based permissions (e.g., only lecturers can create assignments).</w:t>
       </w:r>
     </w:p>
     <w:p>
@@ -104,88 +174,349 @@
           <w:b/>
           <w:bCs/>
         </w:rPr>
-        <w:t>2. Custom User Model</w:t>
+        <w:t>2. Assignment &amp; Test Case Management</w:t>
       </w:r>
     </w:p>
     <w:p>
       <w:pPr>
         <w:numPr>
           <w:ilvl w:val="0"/>
-          <w:numId w:val="2"/>
-        </w:numPr>
-      </w:pPr>
-      <w:r>
-        <w:t>Defined a </w:t>
-      </w:r>
+          <w:numId w:val="13"/>
+        </w:numPr>
+      </w:pPr>
+      <w:r>
+        <w:t xml:space="preserve">Assignment model: title, description, deadline, </w:t>
+      </w:r>
+      <w:proofErr w:type="spellStart"/>
+      <w:r>
+        <w:t>created_by</w:t>
+      </w:r>
+      <w:proofErr w:type="spellEnd"/>
+      <w:r>
+        <w:t>, and a flexible </w:t>
+      </w:r>
+      <w:proofErr w:type="spellStart"/>
+      <w:r>
+        <w:t>grading_config</w:t>
+      </w:r>
+      <w:proofErr w:type="spellEnd"/>
+      <w:r>
+        <w:t> JSON field.</w:t>
+      </w:r>
+    </w:p>
+    <w:p>
+      <w:pPr>
+        <w:numPr>
+          <w:ilvl w:val="0"/>
+          <w:numId w:val="13"/>
+        </w:numPr>
+      </w:pPr>
+      <w:proofErr w:type="spellStart"/>
+      <w:r>
+        <w:t>TestCase</w:t>
+      </w:r>
+      <w:proofErr w:type="spellEnd"/>
+      <w:r>
+        <w:t xml:space="preserve"> model: </w:t>
+      </w:r>
+      <w:proofErr w:type="spellStart"/>
+      <w:r>
+        <w:t>input_data</w:t>
+      </w:r>
+      <w:proofErr w:type="spellEnd"/>
+      <w:r>
+        <w:t xml:space="preserve">, </w:t>
+      </w:r>
+      <w:proofErr w:type="spellStart"/>
+      <w:r>
+        <w:t>expected_output</w:t>
+      </w:r>
+      <w:proofErr w:type="spellEnd"/>
+      <w:r>
+        <w:t xml:space="preserve">, </w:t>
+      </w:r>
+      <w:proofErr w:type="spellStart"/>
+      <w:r>
+        <w:t>is_hidden</w:t>
+      </w:r>
+      <w:proofErr w:type="spellEnd"/>
+      <w:r>
+        <w:t xml:space="preserve"> (hidden test cases are not shown to students).</w:t>
+      </w:r>
+    </w:p>
+    <w:p>
+      <w:pPr>
+        <w:numPr>
+          <w:ilvl w:val="0"/>
+          <w:numId w:val="13"/>
+        </w:numPr>
+      </w:pPr>
+      <w:r>
+        <w:t>Full CRUD APIs (using DRF </w:t>
+      </w:r>
+      <w:proofErr w:type="spellStart"/>
+      <w:r>
+        <w:t>ModelViewSet</w:t>
+      </w:r>
+      <w:proofErr w:type="spellEnd"/>
+      <w:r>
+        <w:t>):</w:t>
+      </w:r>
+    </w:p>
+    <w:p>
+      <w:pPr>
+        <w:numPr>
+          <w:ilvl w:val="1"/>
+          <w:numId w:val="13"/>
+        </w:numPr>
+      </w:pPr>
+      <w:r>
+        <w:t>/</w:t>
+      </w:r>
+      <w:proofErr w:type="spellStart"/>
       <w:proofErr w:type="gramStart"/>
       <w:r>
-        <w:t>User</w:t>
-      </w:r>
+        <w:t>api</w:t>
+      </w:r>
+      <w:proofErr w:type="spellEnd"/>
       <w:proofErr w:type="gramEnd"/>
       <w:r>
-        <w:t> model that extends Django’s AbstractUser and added a role field (student/lecturer).</w:t>
+        <w:t>/assignments/ and /</w:t>
+      </w:r>
+      <w:proofErr w:type="spellStart"/>
+      <w:r>
+        <w:t>api</w:t>
+      </w:r>
+      <w:proofErr w:type="spellEnd"/>
+      <w:r>
+        <w:t>/testcases/.</w:t>
       </w:r>
     </w:p>
     <w:p>
       <w:pPr>
         <w:numPr>
           <w:ilvl w:val="0"/>
-          <w:numId w:val="2"/>
-        </w:numPr>
-      </w:pPr>
-      <w:r>
+          <w:numId w:val="13"/>
+        </w:numPr>
+      </w:pPr>
+      <w:r>
+        <w:t>Lecturers can create, edit, delete assignments and test cases; students can only view.</w:t>
+      </w:r>
+    </w:p>
+    <w:p>
+      <w:pPr>
         <w:rPr>
           <w:b/>
           <w:bCs/>
         </w:rPr>
-        <w:t>Why</w:t>
-      </w:r>
-      <w:r>
-        <w:t>: Django’s default user is fine, but we need to distinguish between students and lecturers to enforce permissions (e.g., only lecturers can create assignments). By using a custom model from the start, we avoid migration headaches later.</w:t>
-      </w:r>
-    </w:p>
-    <w:p>
-      <w:pPr>
+      </w:pPr>
+      <w:r>
         <w:rPr>
           <w:b/>
           <w:bCs/>
         </w:rPr>
-      </w:pPr>
+        <w:t>3. Submission &amp; Grading Engine</w:t>
+      </w:r>
+    </w:p>
+    <w:p>
+      <w:pPr>
+        <w:numPr>
+          <w:ilvl w:val="0"/>
+          <w:numId w:val="14"/>
+        </w:numPr>
+      </w:pPr>
+      <w:r>
+        <w:t xml:space="preserve">Submission model: student, assignment, </w:t>
+      </w:r>
+      <w:proofErr w:type="spellStart"/>
+      <w:r>
+        <w:t>code_file</w:t>
+      </w:r>
+      <w:proofErr w:type="spellEnd"/>
+      <w:r>
+        <w:t xml:space="preserve"> (uploaded Python file), grade, feedback, </w:t>
+      </w:r>
+      <w:proofErr w:type="spellStart"/>
+      <w:r>
+        <w:t>submitted_at</w:t>
+      </w:r>
+      <w:proofErr w:type="spellEnd"/>
+      <w:r>
+        <w:t>.</w:t>
+      </w:r>
+    </w:p>
+    <w:p>
+      <w:pPr>
+        <w:numPr>
+          <w:ilvl w:val="0"/>
+          <w:numId w:val="14"/>
+        </w:numPr>
+      </w:pPr>
+      <w:r>
+        <w:t>File upload endpoint (POST /</w:t>
+      </w:r>
+      <w:proofErr w:type="spellStart"/>
+      <w:r>
+        <w:t>api</w:t>
+      </w:r>
+      <w:proofErr w:type="spellEnd"/>
+      <w:r>
+        <w:t>/submissions/) using multipart/form-data.</w:t>
+      </w:r>
+    </w:p>
+    <w:p>
+      <w:pPr>
+        <w:numPr>
+          <w:ilvl w:val="0"/>
+          <w:numId w:val="14"/>
+        </w:numPr>
+      </w:pPr>
+      <w:r>
+        <w:t>Grading service (grading.py) that:</w:t>
+      </w:r>
+    </w:p>
+    <w:p>
+      <w:pPr>
+        <w:numPr>
+          <w:ilvl w:val="1"/>
+          <w:numId w:val="14"/>
+        </w:numPr>
+      </w:pPr>
+      <w:r>
+        <w:t>Runs student code against test cases with a timeout.</w:t>
+      </w:r>
+    </w:p>
+    <w:p>
+      <w:pPr>
+        <w:numPr>
+          <w:ilvl w:val="1"/>
+          <w:numId w:val="14"/>
+        </w:numPr>
+      </w:pPr>
+      <w:r>
+        <w:t>Awards </w:t>
+      </w:r>
       <w:r>
         <w:rPr>
           <w:b/>
           <w:bCs/>
         </w:rPr>
-        <w:t>3. Authentication with JWT (JSON Web Tokens)</w:t>
+        <w:t>partial credit</w:t>
+      </w:r>
+      <w:r>
+        <w:t> for test cases (0.5 if expected output appears in actual output or numbers match).</w:t>
+      </w:r>
+    </w:p>
+    <w:p>
+      <w:pPr>
+        <w:numPr>
+          <w:ilvl w:val="1"/>
+          <w:numId w:val="14"/>
+        </w:numPr>
+      </w:pPr>
+      <w:r>
+        <w:t>Performs static analysis (AST) to check:</w:t>
+      </w:r>
+    </w:p>
+    <w:p>
+      <w:pPr>
+        <w:numPr>
+          <w:ilvl w:val="2"/>
+          <w:numId w:val="14"/>
+        </w:numPr>
+      </w:pPr>
+      <w:r>
+        <w:t>Syntax errors.</w:t>
+      </w:r>
+    </w:p>
+    <w:p>
+      <w:pPr>
+        <w:numPr>
+          <w:ilvl w:val="2"/>
+          <w:numId w:val="14"/>
+        </w:numPr>
+      </w:pPr>
+      <w:r>
+        <w:lastRenderedPageBreak/>
+        <w:t>Function presence, name, and parameter count (configurable).</w:t>
+      </w:r>
+    </w:p>
+    <w:p>
+      <w:pPr>
+        <w:numPr>
+          <w:ilvl w:val="2"/>
+          <w:numId w:val="14"/>
+        </w:numPr>
+      </w:pPr>
+      <w:r>
+        <w:t>Return statement presence.</w:t>
+      </w:r>
+    </w:p>
+    <w:p>
+      <w:pPr>
+        <w:numPr>
+          <w:ilvl w:val="2"/>
+          <w:numId w:val="14"/>
+        </w:numPr>
+      </w:pPr>
+      <w:r>
+        <w:t>Docstring presence.</w:t>
+      </w:r>
+    </w:p>
+    <w:p>
+      <w:pPr>
+        <w:numPr>
+          <w:ilvl w:val="1"/>
+          <w:numId w:val="14"/>
+        </w:numPr>
+      </w:pPr>
+      <w:r>
+        <w:t>Runs </w:t>
+      </w:r>
+      <w:proofErr w:type="spellStart"/>
+      <w:r>
+        <w:t>pylint</w:t>
+      </w:r>
+      <w:proofErr w:type="spellEnd"/>
+      <w:r>
+        <w:t> to assign a style score.</w:t>
+      </w:r>
+    </w:p>
+    <w:p>
+      <w:pPr>
+        <w:numPr>
+          <w:ilvl w:val="1"/>
+          <w:numId w:val="14"/>
+        </w:numPr>
+      </w:pPr>
+      <w:r>
+        <w:t>Reads the assignment’s </w:t>
+      </w:r>
+      <w:proofErr w:type="spellStart"/>
+      <w:r>
+        <w:t>grading_config</w:t>
+      </w:r>
+      <w:proofErr w:type="spellEnd"/>
+      <w:r>
+        <w:t> to enable/disable checks and adjust weights (syntax, function, return, tests, style, docstring).</w:t>
+      </w:r>
+    </w:p>
+    <w:p>
+      <w:pPr>
+        <w:numPr>
+          <w:ilvl w:val="1"/>
+          <w:numId w:val="14"/>
+        </w:numPr>
+      </w:pPr>
+      <w:r>
+        <w:t>Generates a detailed breakdown of points.</w:t>
       </w:r>
     </w:p>
     <w:p>
       <w:pPr>
         <w:numPr>
           <w:ilvl w:val="0"/>
-          <w:numId w:val="3"/>
-        </w:numPr>
-      </w:pPr>
-      <w:r>
-        <w:t>Installed djangorestframework-simplejwt.</w:t>
-      </w:r>
-    </w:p>
-    <w:p>
-      <w:pPr>
-        <w:numPr>
-          <w:ilvl w:val="0"/>
-          <w:numId w:val="3"/>
-        </w:numPr>
-      </w:pPr>
-      <w:r>
-        <w:t>Created endpoints for register, login, and token/refresh.</w:t>
-      </w:r>
-    </w:p>
-    <w:p>
-      <w:pPr>
-        <w:numPr>
-          <w:ilvl w:val="0"/>
-          <w:numId w:val="3"/>
+          <w:numId w:val="14"/>
         </w:numPr>
       </w:pPr>
       <w:r>
@@ -193,70 +524,85 @@
           <w:b/>
           <w:bCs/>
         </w:rPr>
-        <w:t>Why</w:t>
-      </w:r>
-      <w:r>
-        <w:t>: JWT is a stateless, secure way to authenticate API requests. When a user logs in, they receive an access token (short</w:t>
-      </w:r>
-      <w:r>
-        <w:noBreakHyphen/>
-        <w:t>lived) and a refresh token (long</w:t>
-      </w:r>
-      <w:r>
-        <w:noBreakHyphen/>
-        <w:t>lived). The frontend sends the access token with every protected request. This is standard practice for modern web APIs.</w:t>
-      </w:r>
-    </w:p>
-    <w:p>
-      <w:pPr>
+        <w:t>AI</w:t>
+      </w:r>
+      <w:r>
         <w:rPr>
           <w:b/>
           <w:bCs/>
         </w:rPr>
-      </w:pPr>
-      <w:r>
+        <w:noBreakHyphen/>
+        <w:t>generated feedback</w:t>
+      </w:r>
+      <w:r>
+        <w:t> using Google Gemini API:</w:t>
+      </w:r>
+    </w:p>
+    <w:p>
+      <w:pPr>
+        <w:numPr>
+          <w:ilvl w:val="1"/>
+          <w:numId w:val="14"/>
+        </w:numPr>
+      </w:pPr>
+      <w:r>
+        <w:t>Sends the student’s code, test results, and assignment description.</w:t>
+      </w:r>
+    </w:p>
+    <w:p>
+      <w:pPr>
+        <w:numPr>
+          <w:ilvl w:val="1"/>
+          <w:numId w:val="14"/>
+        </w:numPr>
+      </w:pPr>
+      <w:r>
+        <w:t>Appends a short, encouraging suggestion to the feedback.</w:t>
+      </w:r>
+    </w:p>
+    <w:p>
+      <w:pPr>
+        <w:numPr>
+          <w:ilvl w:val="1"/>
+          <w:numId w:val="14"/>
+        </w:numPr>
+      </w:pPr>
+      <w:r>
+        <w:t>Requires a GEMINI_API_KEY environment variable.</w:t>
+      </w:r>
+    </w:p>
+    <w:p>
+      <w:pPr>
         <w:rPr>
           <w:b/>
           <w:bCs/>
         </w:rPr>
-        <w:t>4. Admin Panel Integration</w:t>
-      </w:r>
-    </w:p>
-    <w:p>
-      <w:pPr>
-        <w:numPr>
-          <w:ilvl w:val="0"/>
-          <w:numId w:val="4"/>
-        </w:numPr>
-      </w:pPr>
-      <w:r>
-        <w:t xml:space="preserve">Registered User in the admin </w:t>
-      </w:r>
-      <w:proofErr w:type="gramStart"/>
-      <w:r>
-        <w:t>and also</w:t>
-      </w:r>
-      <w:proofErr w:type="gramEnd"/>
-      <w:r>
-        <w:t xml:space="preserve"> later Assignment and TestCase.</w:t>
-      </w:r>
-    </w:p>
-    <w:p>
-      <w:pPr>
-        <w:numPr>
-          <w:ilvl w:val="0"/>
-          <w:numId w:val="4"/>
-        </w:numPr>
       </w:pPr>
       <w:r>
         <w:rPr>
           <w:b/>
           <w:bCs/>
         </w:rPr>
-        <w:t>Why</w:t>
-      </w:r>
-      <w:r>
-        <w:t>: The admin panel gives us a quick way to inspect and manage data while developing. It’s also useful for creating initial data (like lecturer users) without writing code.</w:t>
+        <w:t>4. Admin Interface</w:t>
+      </w:r>
+    </w:p>
+    <w:p>
+      <w:pPr>
+        <w:numPr>
+          <w:ilvl w:val="0"/>
+          <w:numId w:val="15"/>
+        </w:numPr>
+      </w:pPr>
+      <w:r>
+        <w:t>All models (User, Assignment, </w:t>
+      </w:r>
+      <w:proofErr w:type="spellStart"/>
+      <w:r>
+        <w:t>TestCase</w:t>
+      </w:r>
+      <w:proofErr w:type="spellEnd"/>
+      <w:r>
+        <w:t>, Submission) are registered in Django admin for easy inspection and data management.</w:t>
       </w:r>
     </w:p>
     <w:p>
@@ -271,25 +617,614 @@
           <w:b/>
           <w:bCs/>
         </w:rPr>
-        <w:t>5. Assignment &amp; TestCase Models</w:t>
+        <w:t>5. API Documentation</w:t>
       </w:r>
     </w:p>
     <w:p>
       <w:pPr>
         <w:numPr>
           <w:ilvl w:val="0"/>
-          <w:numId w:val="5"/>
-        </w:numPr>
-      </w:pPr>
-      <w:r>
-        <w:t>Created Assignment (title, description, deadline, created_by) and TestCase (input_data, expected_output, is_hidden, foreign key to Assignment).</w:t>
+          <w:numId w:val="16"/>
+        </w:numPr>
+      </w:pPr>
+      <w:r>
+        <w:t>A complete document listing every endpoint, required headers, request/response examples, and file upload instructions. It also explains how to handle token expiration and refresh.</w:t>
+      </w:r>
+    </w:p>
+    <w:p>
+      <w:pPr>
+        <w:rPr>
+          <w:b/>
+          <w:bCs/>
+        </w:rPr>
+      </w:pPr>
+      <w:r>
+        <w:rPr>
+          <w:b/>
+          <w:bCs/>
+        </w:rPr>
+        <w:t>6. Environment &amp; Repository</w:t>
       </w:r>
     </w:p>
     <w:p>
       <w:pPr>
         <w:numPr>
           <w:ilvl w:val="0"/>
-          <w:numId w:val="5"/>
+          <w:numId w:val="17"/>
+        </w:numPr>
+      </w:pPr>
+      <w:r>
+        <w:t xml:space="preserve">requirements.txt includes all necessary packages (Django, DRF, JWT, </w:t>
+      </w:r>
+      <w:proofErr w:type="spellStart"/>
+      <w:r>
+        <w:t>corsheaders</w:t>
+      </w:r>
+      <w:proofErr w:type="spellEnd"/>
+      <w:r>
+        <w:t xml:space="preserve">, </w:t>
+      </w:r>
+      <w:proofErr w:type="spellStart"/>
+      <w:r>
+        <w:t>pylint</w:t>
+      </w:r>
+      <w:proofErr w:type="spellEnd"/>
+      <w:r>
+        <w:t>, google-</w:t>
+      </w:r>
+      <w:proofErr w:type="spellStart"/>
+      <w:r>
+        <w:t>generativeai</w:t>
+      </w:r>
+      <w:proofErr w:type="spellEnd"/>
+      <w:r>
+        <w:t>, etc.).</w:t>
+      </w:r>
+    </w:p>
+    <w:p>
+      <w:pPr>
+        <w:numPr>
+          <w:ilvl w:val="0"/>
+          <w:numId w:val="17"/>
+        </w:numPr>
+      </w:pPr>
+      <w:proofErr w:type="gramStart"/>
+      <w:r>
+        <w:t>.</w:t>
+      </w:r>
+      <w:proofErr w:type="spellStart"/>
+      <w:r>
+        <w:t>gitignore</w:t>
+      </w:r>
+      <w:proofErr w:type="spellEnd"/>
+      <w:proofErr w:type="gramEnd"/>
+      <w:r>
+        <w:t> excludes virtual environment, database, and media files.</w:t>
+      </w:r>
+    </w:p>
+    <w:p>
+      <w:pPr>
+        <w:numPr>
+          <w:ilvl w:val="0"/>
+          <w:numId w:val="17"/>
+        </w:numPr>
+      </w:pPr>
+      <w:r>
+        <w:t>Code is pushed to the shared GitHub repository. Anyone can clone, create a virtual environment, install dependencies, and run the server.</w:t>
+      </w:r>
+    </w:p>
+    <w:p>
+      <w:r>
+        <w:pict w14:anchorId="6BD4B60A">
+          <v:rect id="_x0000_i1049" style="width:0;height:.75pt" o:hralign="center" o:hrstd="t" o:hr="t" fillcolor="#a0a0a0" stroked="f"/>
+        </w:pict>
+      </w:r>
+    </w:p>
+    <w:p>
+      <w:pPr>
+        <w:rPr>
+          <w:b/>
+          <w:bCs/>
+        </w:rPr>
+      </w:pPr>
+      <w:r>
+        <w:rPr>
+          <w:b/>
+          <w:bCs/>
+        </w:rPr>
+        <w:t>What the Other Backend Developer Must Do (Plagiarism Module)</w:t>
+      </w:r>
+    </w:p>
+    <w:p>
+      <w:r>
+        <w:t>You will build the plagiarism detection component using the existing models.</w:t>
+      </w:r>
+    </w:p>
+    <w:p>
+      <w:pPr>
+        <w:rPr>
+          <w:b/>
+          <w:bCs/>
+        </w:rPr>
+      </w:pPr>
+      <w:r>
+        <w:rPr>
+          <w:b/>
+          <w:bCs/>
+        </w:rPr>
+        <w:t>Tasks</w:t>
+      </w:r>
+    </w:p>
+    <w:p>
+      <w:pPr>
+        <w:numPr>
+          <w:ilvl w:val="0"/>
+          <w:numId w:val="18"/>
+        </w:numPr>
+      </w:pPr>
+      <w:r>
+        <w:rPr>
+          <w:b/>
+          <w:bCs/>
+        </w:rPr>
+        <w:t>Create a new app</w:t>
+      </w:r>
+    </w:p>
+    <w:p>
+      <w:r>
+        <w:t>bash</w:t>
+      </w:r>
+    </w:p>
+    <w:p>
+      <w:r>
+        <w:lastRenderedPageBreak/>
+        <w:t xml:space="preserve">python manage.py </w:t>
+      </w:r>
+      <w:proofErr w:type="spellStart"/>
+      <w:r>
+        <w:t>startapp</w:t>
+      </w:r>
+      <w:proofErr w:type="spellEnd"/>
+      <w:r>
+        <w:t xml:space="preserve"> plagiarism</w:t>
+      </w:r>
+    </w:p>
+    <w:p>
+      <w:r>
+        <w:t>Add 'plagiarism' to INSTALLED_APPS in settings.py.</w:t>
+      </w:r>
+    </w:p>
+    <w:p>
+      <w:pPr>
+        <w:numPr>
+          <w:ilvl w:val="0"/>
+          <w:numId w:val="18"/>
+        </w:numPr>
+      </w:pPr>
+      <w:r>
+        <w:rPr>
+          <w:b/>
+          <w:bCs/>
+        </w:rPr>
+        <w:t>Define the model</w:t>
+      </w:r>
+      <w:r>
+        <w:br/>
+        <w:t>In plagiarism/models.py, create </w:t>
+      </w:r>
+      <w:proofErr w:type="spellStart"/>
+      <w:r>
+        <w:t>PlagiarismReport</w:t>
+      </w:r>
+      <w:proofErr w:type="spellEnd"/>
+      <w:r>
+        <w:t> with:</w:t>
+      </w:r>
+    </w:p>
+    <w:p>
+      <w:pPr>
+        <w:numPr>
+          <w:ilvl w:val="1"/>
+          <w:numId w:val="18"/>
+        </w:numPr>
+      </w:pPr>
+      <w:r>
+        <w:t>submission1 (</w:t>
+      </w:r>
+      <w:proofErr w:type="spellStart"/>
+      <w:r>
+        <w:t>ForeignKey</w:t>
+      </w:r>
+      <w:proofErr w:type="spellEnd"/>
+      <w:r>
+        <w:t xml:space="preserve"> to </w:t>
+      </w:r>
+      <w:proofErr w:type="spellStart"/>
+      <w:proofErr w:type="gramStart"/>
+      <w:r>
+        <w:t>submissions.Submission</w:t>
+      </w:r>
+      <w:proofErr w:type="spellEnd"/>
+      <w:proofErr w:type="gramEnd"/>
+      <w:r>
+        <w:t>)</w:t>
+      </w:r>
+    </w:p>
+    <w:p>
+      <w:pPr>
+        <w:numPr>
+          <w:ilvl w:val="1"/>
+          <w:numId w:val="18"/>
+        </w:numPr>
+      </w:pPr>
+      <w:r>
+        <w:t>submission2 (</w:t>
+      </w:r>
+      <w:proofErr w:type="spellStart"/>
+      <w:r>
+        <w:t>ForeignKey</w:t>
+      </w:r>
+      <w:proofErr w:type="spellEnd"/>
+      <w:r>
+        <w:t xml:space="preserve"> to </w:t>
+      </w:r>
+      <w:proofErr w:type="spellStart"/>
+      <w:proofErr w:type="gramStart"/>
+      <w:r>
+        <w:t>submissions.Submission</w:t>
+      </w:r>
+      <w:proofErr w:type="spellEnd"/>
+      <w:proofErr w:type="gramEnd"/>
+      <w:r>
+        <w:t>)</w:t>
+      </w:r>
+    </w:p>
+    <w:p>
+      <w:pPr>
+        <w:numPr>
+          <w:ilvl w:val="1"/>
+          <w:numId w:val="18"/>
+        </w:numPr>
+      </w:pPr>
+      <w:proofErr w:type="spellStart"/>
+      <w:r>
+        <w:t>similarity_score</w:t>
+      </w:r>
+      <w:proofErr w:type="spellEnd"/>
+      <w:r>
+        <w:t> (</w:t>
+      </w:r>
+      <w:proofErr w:type="spellStart"/>
+      <w:r>
+        <w:t>FloatField</w:t>
+      </w:r>
+      <w:proofErr w:type="spellEnd"/>
+      <w:r>
+        <w:t>)</w:t>
+      </w:r>
+    </w:p>
+    <w:p>
+      <w:pPr>
+        <w:numPr>
+          <w:ilvl w:val="1"/>
+          <w:numId w:val="18"/>
+        </w:numPr>
+      </w:pPr>
+      <w:r>
+        <w:t>assignment (</w:t>
+      </w:r>
+      <w:proofErr w:type="spellStart"/>
+      <w:r>
+        <w:t>ForeignKey</w:t>
+      </w:r>
+      <w:proofErr w:type="spellEnd"/>
+      <w:r>
+        <w:t xml:space="preserve"> to </w:t>
+      </w:r>
+      <w:proofErr w:type="spellStart"/>
+      <w:proofErr w:type="gramStart"/>
+      <w:r>
+        <w:t>assignments.Assignment</w:t>
+      </w:r>
+      <w:proofErr w:type="spellEnd"/>
+      <w:proofErr w:type="gramEnd"/>
+      <w:r>
+        <w:t>)</w:t>
+      </w:r>
+    </w:p>
+    <w:p>
+      <w:pPr>
+        <w:numPr>
+          <w:ilvl w:val="1"/>
+          <w:numId w:val="18"/>
+        </w:numPr>
+      </w:pPr>
+      <w:proofErr w:type="spellStart"/>
+      <w:r>
+        <w:t>created_at</w:t>
+      </w:r>
+      <w:proofErr w:type="spellEnd"/>
+      <w:r>
+        <w:t> (</w:t>
+      </w:r>
+      <w:proofErr w:type="spellStart"/>
+      <w:r>
+        <w:t>auto_now_add</w:t>
+      </w:r>
+      <w:proofErr w:type="spellEnd"/>
+      <w:r>
+        <w:t>)</w:t>
+      </w:r>
+    </w:p>
+    <w:p>
+      <w:pPr>
+        <w:numPr>
+          <w:ilvl w:val="1"/>
+          <w:numId w:val="18"/>
+        </w:numPr>
+      </w:pPr>
+      <w:r>
+        <w:t>reviewed (</w:t>
+      </w:r>
+      <w:proofErr w:type="spellStart"/>
+      <w:r>
+        <w:t>BooleanField</w:t>
+      </w:r>
+      <w:proofErr w:type="spellEnd"/>
+      <w:r>
+        <w:t>, default False)</w:t>
+      </w:r>
+    </w:p>
+    <w:p>
+      <w:pPr>
+        <w:numPr>
+          <w:ilvl w:val="1"/>
+          <w:numId w:val="18"/>
+        </w:numPr>
+      </w:pPr>
+      <w:r>
+        <w:t>notes (</w:t>
+      </w:r>
+      <w:proofErr w:type="spellStart"/>
+      <w:r>
+        <w:t>TextField</w:t>
+      </w:r>
+      <w:proofErr w:type="spellEnd"/>
+      <w:r>
+        <w:t>, blank)</w:t>
+      </w:r>
+      <w:r>
+        <w:br/>
+        <w:t>Run migrations.</w:t>
+      </w:r>
+    </w:p>
+    <w:p>
+      <w:pPr>
+        <w:numPr>
+          <w:ilvl w:val="0"/>
+          <w:numId w:val="18"/>
+        </w:numPr>
+      </w:pPr>
+      <w:r>
+        <w:rPr>
+          <w:b/>
+          <w:bCs/>
+        </w:rPr>
+        <w:t>Implement similarity detection</w:t>
+      </w:r>
+      <w:r>
+        <w:br/>
+        <w:t>Write a function that:</w:t>
+      </w:r>
+    </w:p>
+    <w:p>
+      <w:pPr>
+        <w:numPr>
+          <w:ilvl w:val="1"/>
+          <w:numId w:val="18"/>
+        </w:numPr>
+      </w:pPr>
+      <w:r>
+        <w:t>Takes an assignment ID.</w:t>
+      </w:r>
+    </w:p>
+    <w:p>
+      <w:pPr>
+        <w:numPr>
+          <w:ilvl w:val="1"/>
+          <w:numId w:val="18"/>
+        </w:numPr>
+      </w:pPr>
+      <w:r>
+        <w:t>Fetches all submissions for that assignment.</w:t>
+      </w:r>
+    </w:p>
+    <w:p>
+      <w:pPr>
+        <w:numPr>
+          <w:ilvl w:val="1"/>
+          <w:numId w:val="18"/>
+        </w:numPr>
+      </w:pPr>
+      <w:r>
+        <w:t>For each pair, compute a similarity score (use </w:t>
+      </w:r>
+      <w:proofErr w:type="spellStart"/>
+      <w:proofErr w:type="gramStart"/>
+      <w:r>
+        <w:t>difflib.SequenceMatcher</w:t>
+      </w:r>
+      <w:proofErr w:type="spellEnd"/>
+      <w:proofErr w:type="gramEnd"/>
+      <w:r>
+        <w:t> and optionally </w:t>
+      </w:r>
+      <w:proofErr w:type="spellStart"/>
+      <w:r>
+        <w:t>pycode_similar</w:t>
+      </w:r>
+      <w:proofErr w:type="spellEnd"/>
+      <w:r>
+        <w:t> for AST</w:t>
+      </w:r>
+      <w:r>
+        <w:noBreakHyphen/>
+        <w:t>based comparison).</w:t>
+      </w:r>
+    </w:p>
+    <w:p>
+      <w:pPr>
+        <w:numPr>
+          <w:ilvl w:val="1"/>
+          <w:numId w:val="18"/>
+        </w:numPr>
+      </w:pPr>
+      <w:r>
+        <w:t>Create </w:t>
+      </w:r>
+      <w:proofErr w:type="spellStart"/>
+      <w:r>
+        <w:t>PlagiarismReport</w:t>
+      </w:r>
+      <w:proofErr w:type="spellEnd"/>
+      <w:r>
+        <w:t> entries (avoid duplicates). Store the score.</w:t>
+      </w:r>
+    </w:p>
+    <w:p>
+      <w:pPr>
+        <w:numPr>
+          <w:ilvl w:val="0"/>
+          <w:numId w:val="18"/>
+        </w:numPr>
+      </w:pPr>
+      <w:r>
+        <w:rPr>
+          <w:b/>
+          <w:bCs/>
+        </w:rPr>
+        <w:t>Create API endpoints</w:t>
+      </w:r>
+      <w:r>
+        <w:t> (lecturer only)</w:t>
+      </w:r>
+    </w:p>
+    <w:p>
+      <w:pPr>
+        <w:numPr>
+          <w:ilvl w:val="1"/>
+          <w:numId w:val="18"/>
+        </w:numPr>
+      </w:pPr>
+      <w:r>
+        <w:t>POST /</w:t>
+      </w:r>
+      <w:proofErr w:type="spellStart"/>
+      <w:r>
+        <w:t>api</w:t>
+      </w:r>
+      <w:proofErr w:type="spellEnd"/>
+      <w:r>
+        <w:t>/plagiarism/check/ – receives </w:t>
+      </w:r>
+      <w:proofErr w:type="spellStart"/>
+      <w:r>
+        <w:t>assignment_id</w:t>
+      </w:r>
+      <w:proofErr w:type="spellEnd"/>
+      <w:r>
+        <w:t>, runs detection, returns status.</w:t>
+      </w:r>
+    </w:p>
+    <w:p>
+      <w:pPr>
+        <w:numPr>
+          <w:ilvl w:val="1"/>
+          <w:numId w:val="18"/>
+        </w:numPr>
+      </w:pPr>
+      <w:r>
+        <w:t>GET /</w:t>
+      </w:r>
+      <w:proofErr w:type="spellStart"/>
+      <w:r>
+        <w:t>api</w:t>
+      </w:r>
+      <w:proofErr w:type="spellEnd"/>
+      <w:r>
+        <w:t>/plagiarism/?assignment=id – returns list of reports for that assignment.</w:t>
+      </w:r>
+    </w:p>
+    <w:p>
+      <w:pPr>
+        <w:numPr>
+          <w:ilvl w:val="1"/>
+          <w:numId w:val="18"/>
+        </w:numPr>
+      </w:pPr>
+      <w:r>
+        <w:t>PATCH /</w:t>
+      </w:r>
+      <w:proofErr w:type="spellStart"/>
+      <w:r>
+        <w:t>api</w:t>
+      </w:r>
+      <w:proofErr w:type="spellEnd"/>
+      <w:r>
+        <w:t>/plagiarism/{id}/ – allows lecturer to update reviewed and notes.</w:t>
+      </w:r>
+    </w:p>
+    <w:p>
+      <w:pPr>
+        <w:numPr>
+          <w:ilvl w:val="0"/>
+          <w:numId w:val="18"/>
+        </w:numPr>
+      </w:pPr>
+      <w:r>
+        <w:rPr>
+          <w:b/>
+          <w:bCs/>
+        </w:rPr>
+        <w:t>Permissions</w:t>
+      </w:r>
+      <w:r>
+        <w:t> – use custom permission to ensure only lecturers can access these endpoints.</w:t>
+      </w:r>
+    </w:p>
+    <w:p>
+      <w:pPr>
+        <w:numPr>
+          <w:ilvl w:val="0"/>
+          <w:numId w:val="18"/>
+        </w:numPr>
+      </w:pPr>
+      <w:r>
+        <w:rPr>
+          <w:b/>
+          <w:bCs/>
+        </w:rPr>
+        <w:t>URLs</w:t>
+      </w:r>
+      <w:r>
+        <w:t> – include </w:t>
+      </w:r>
+      <w:proofErr w:type="spellStart"/>
+      <w:proofErr w:type="gramStart"/>
+      <w:r>
+        <w:t>plagiarism.urls</w:t>
+      </w:r>
+      <w:proofErr w:type="spellEnd"/>
+      <w:proofErr w:type="gramEnd"/>
+      <w:r>
+        <w:t> in the main urls.py.</w:t>
+      </w:r>
+    </w:p>
+    <w:p>
+      <w:pPr>
+        <w:numPr>
+          <w:ilvl w:val="0"/>
+          <w:numId w:val="18"/>
         </w:numPr>
       </w:pPr>
       <w:r>
@@ -298,18 +1233,10 @@
           <w:bCs/>
         </w:rPr>
         <w:lastRenderedPageBreak/>
-        <w:t>Why</w:t>
-      </w:r>
-      <w:r>
-        <w:t xml:space="preserve">: These models represent the core domain of our system. Assignments are what students submit; test cases define the “correctness” criteria. By storing test cases separately, we can reuse them for multiple submissions </w:t>
-      </w:r>
-      <w:proofErr w:type="gramStart"/>
-      <w:r>
-        <w:t>and also</w:t>
-      </w:r>
-      <w:proofErr w:type="gramEnd"/>
-      <w:r>
-        <w:t xml:space="preserve"> hide some tests from students (for integrity).</w:t>
+        <w:t>Optional</w:t>
+      </w:r>
+      <w:r>
+        <w:t> – provide a management command to run plagiarism for an assignment from the command line.</w:t>
       </w:r>
     </w:p>
     <w:p>
@@ -324,99 +1251,115 @@
           <w:b/>
           <w:bCs/>
         </w:rPr>
-        <w:t>6. API Endpoints with DRF Viewsets</w:t>
+        <w:t>Integration Notes</w:t>
       </w:r>
     </w:p>
     <w:p>
       <w:pPr>
         <w:numPr>
           <w:ilvl w:val="0"/>
-          <w:numId w:val="6"/>
-        </w:numPr>
-      </w:pPr>
-      <w:r>
-        <w:t>Built AssignmentViewSet and TestCaseViewSet.</w:t>
+          <w:numId w:val="19"/>
+        </w:numPr>
+      </w:pPr>
+      <w:r>
+        <w:t>You can import Submission from </w:t>
+      </w:r>
+      <w:proofErr w:type="spellStart"/>
+      <w:proofErr w:type="gramStart"/>
+      <w:r>
+        <w:t>submissions.models</w:t>
+      </w:r>
+      <w:proofErr w:type="spellEnd"/>
+      <w:proofErr w:type="gramEnd"/>
+      <w:r>
+        <w:t>.</w:t>
       </w:r>
     </w:p>
     <w:p>
       <w:pPr>
         <w:numPr>
           <w:ilvl w:val="0"/>
-          <w:numId w:val="6"/>
-        </w:numPr>
-      </w:pPr>
-      <w:r>
-        <w:t>Used ModelViewSet which automatically provides list, create, retrieve, update, delete endpoints.</w:t>
+          <w:numId w:val="19"/>
+        </w:numPr>
+      </w:pPr>
+      <w:r>
+        <w:t>Use </w:t>
+      </w:r>
+      <w:proofErr w:type="spellStart"/>
+      <w:r>
+        <w:t>Submission.code_file</w:t>
+      </w:r>
+      <w:proofErr w:type="spellEnd"/>
+      <w:r>
+        <w:t> to read the file content (you may need to open it with Django’s </w:t>
+      </w:r>
+      <w:proofErr w:type="spellStart"/>
+      <w:r>
+        <w:t>default_storage</w:t>
+      </w:r>
+      <w:proofErr w:type="spellEnd"/>
+      <w:r>
+        <w:t>).</w:t>
       </w:r>
     </w:p>
     <w:p>
       <w:pPr>
         <w:numPr>
           <w:ilvl w:val="0"/>
-          <w:numId w:val="6"/>
-        </w:numPr>
-      </w:pPr>
-      <w:r>
+          <w:numId w:val="19"/>
+        </w:numPr>
+      </w:pPr>
+      <w:r>
+        <w:t>The frontend will later call the /check/ endpoint when a lecturer clicks a button.</w:t>
+      </w:r>
+    </w:p>
+    <w:p>
+      <w:r>
+        <w:pict w14:anchorId="5A58997D">
+          <v:rect id="_x0000_i1050" style="width:0;height:.75pt" o:hralign="center" o:hrstd="t" o:hr="t" fillcolor="#a0a0a0" stroked="f"/>
+        </w:pict>
+      </w:r>
+    </w:p>
+    <w:p>
+      <w:pPr>
         <w:rPr>
           <w:b/>
           <w:bCs/>
         </w:rPr>
-        <w:t>Why</w:t>
-      </w:r>
-      <w:r>
-        <w:t>: This reduces boilerplate code. The viewset handles all common CRUD operations, and we only need to add custom permission logic.</w:t>
-      </w:r>
-    </w:p>
-    <w:p>
-      <w:pPr>
+      </w:pPr>
+      <w:r>
         <w:rPr>
           <w:b/>
           <w:bCs/>
         </w:rPr>
-      </w:pPr>
-      <w:r>
+        <w:t>What the Frontend Team Must Do (React)</w:t>
+      </w:r>
+    </w:p>
+    <w:p>
+      <w:r>
+        <w:t>You will build the user interface that consumes the backend APIs.</w:t>
+      </w:r>
+    </w:p>
+    <w:p>
+      <w:pPr>
         <w:rPr>
           <w:b/>
           <w:bCs/>
         </w:rPr>
-        <w:t>7. Role</w:t>
-      </w:r>
+      </w:pPr>
       <w:r>
         <w:rPr>
           <w:b/>
           <w:bCs/>
         </w:rPr>
-        <w:noBreakHyphen/>
-        <w:t>Based Permissions</w:t>
+        <w:t>Tasks</w:t>
       </w:r>
     </w:p>
     <w:p>
       <w:pPr>
         <w:numPr>
           <w:ilvl w:val="0"/>
-          <w:numId w:val="7"/>
-        </w:numPr>
-      </w:pPr>
-      <w:r>
-        <w:t>Created a custom permission class IsLecturerOrReadOnly.</w:t>
-      </w:r>
-    </w:p>
-    <w:p>
-      <w:pPr>
-        <w:numPr>
-          <w:ilvl w:val="0"/>
-          <w:numId w:val="7"/>
-        </w:numPr>
-      </w:pPr>
-      <w:r>
-        <w:t>Applied it to both viewsets.</w:t>
-      </w:r>
-    </w:p>
-    <w:p>
-      <w:pPr>
-        <w:numPr>
-          <w:ilvl w:val="0"/>
-          <w:numId w:val="7"/>
+          <w:numId w:val="20"/>
         </w:numPr>
       </w:pPr>
       <w:r>
@@ -424,17 +1367,74 @@
           <w:b/>
           <w:bCs/>
         </w:rPr>
-        <w:t>Why</w:t>
-      </w:r>
-      <w:r>
-        <w:t>: We want:</w:t>
+        <w:t>Authentication</w:t>
       </w:r>
     </w:p>
     <w:p>
       <w:pPr>
         <w:numPr>
           <w:ilvl w:val="1"/>
-          <w:numId w:val="7"/>
+          <w:numId w:val="20"/>
+        </w:numPr>
+      </w:pPr>
+      <w:r>
+        <w:t>Registration page with role selection (student/lecturer).</w:t>
+      </w:r>
+    </w:p>
+    <w:p>
+      <w:pPr>
+        <w:numPr>
+          <w:ilvl w:val="1"/>
+          <w:numId w:val="20"/>
+        </w:numPr>
+      </w:pPr>
+      <w:r>
+        <w:t xml:space="preserve">Login page – store access and refresh tokens (e.g., in </w:t>
+      </w:r>
+      <w:proofErr w:type="spellStart"/>
+      <w:r>
+        <w:t>localStorage</w:t>
+      </w:r>
+      <w:proofErr w:type="spellEnd"/>
+      <w:r>
+        <w:t xml:space="preserve"> or </w:t>
+      </w:r>
+      <w:proofErr w:type="spellStart"/>
+      <w:r>
+        <w:t>httpOnly</w:t>
+      </w:r>
+      <w:proofErr w:type="spellEnd"/>
+      <w:r>
+        <w:t xml:space="preserve"> cookies).</w:t>
+      </w:r>
+    </w:p>
+    <w:p>
+      <w:pPr>
+        <w:numPr>
+          <w:ilvl w:val="1"/>
+          <w:numId w:val="20"/>
+        </w:numPr>
+      </w:pPr>
+      <w:r>
+        <w:t>Decode the JWT to get the user’s role and redirect to the appropriate dashboard.</w:t>
+      </w:r>
+    </w:p>
+    <w:p>
+      <w:pPr>
+        <w:numPr>
+          <w:ilvl w:val="1"/>
+          <w:numId w:val="20"/>
+        </w:numPr>
+      </w:pPr>
+      <w:r>
+        <w:t>Implement token refresh when 401 responses occur.</w:t>
+      </w:r>
+    </w:p>
+    <w:p>
+      <w:pPr>
+        <w:numPr>
+          <w:ilvl w:val="0"/>
+          <w:numId w:val="20"/>
         </w:numPr>
       </w:pPr>
       <w:r>
@@ -442,17 +1442,101 @@
           <w:b/>
           <w:bCs/>
         </w:rPr>
-        <w:t>Lecturers</w:t>
-      </w:r>
-      <w:r>
-        <w:t>: full CRUD access (create, edit, delete assignments and test cases).</w:t>
+        <w:t>Student Dashboard</w:t>
       </w:r>
     </w:p>
     <w:p>
       <w:pPr>
         <w:numPr>
           <w:ilvl w:val="1"/>
-          <w:numId w:val="7"/>
+          <w:numId w:val="20"/>
+        </w:numPr>
+      </w:pPr>
+      <w:r>
+        <w:t>List all assignments (fetch from /</w:t>
+      </w:r>
+      <w:proofErr w:type="spellStart"/>
+      <w:r>
+        <w:t>api</w:t>
+      </w:r>
+      <w:proofErr w:type="spellEnd"/>
+      <w:r>
+        <w:t>/assignments/).</w:t>
+      </w:r>
+    </w:p>
+    <w:p>
+      <w:pPr>
+        <w:numPr>
+          <w:ilvl w:val="1"/>
+          <w:numId w:val="20"/>
+        </w:numPr>
+      </w:pPr>
+      <w:r>
+        <w:t>Click on an assignment to see its details and visible test cases (from /</w:t>
+      </w:r>
+      <w:proofErr w:type="spellStart"/>
+      <w:r>
+        <w:t>api</w:t>
+      </w:r>
+      <w:proofErr w:type="spellEnd"/>
+      <w:r>
+        <w:t>/testcases/?assignment=id).</w:t>
+      </w:r>
+    </w:p>
+    <w:p>
+      <w:pPr>
+        <w:numPr>
+          <w:ilvl w:val="1"/>
+          <w:numId w:val="20"/>
+        </w:numPr>
+      </w:pPr>
+      <w:r>
+        <w:t>Submission form: file upload (use </w:t>
+      </w:r>
+      <w:proofErr w:type="spellStart"/>
+      <w:r>
+        <w:t>FormData</w:t>
+      </w:r>
+      <w:proofErr w:type="spellEnd"/>
+      <w:r>
+        <w:t>) to /</w:t>
+      </w:r>
+      <w:proofErr w:type="spellStart"/>
+      <w:r>
+        <w:t>api</w:t>
+      </w:r>
+      <w:proofErr w:type="spellEnd"/>
+      <w:r>
+        <w:t>/submissions/.</w:t>
+      </w:r>
+    </w:p>
+    <w:p>
+      <w:pPr>
+        <w:numPr>
+          <w:ilvl w:val="1"/>
+          <w:numId w:val="20"/>
+        </w:numPr>
+      </w:pPr>
+      <w:r>
+        <w:t>Display the returned grade and feedback (including AI suggestions).</w:t>
+      </w:r>
+    </w:p>
+    <w:p>
+      <w:pPr>
+        <w:numPr>
+          <w:ilvl w:val="1"/>
+          <w:numId w:val="20"/>
+        </w:numPr>
+      </w:pPr>
+      <w:r>
+        <w:t>Show a history of past submissions (optional).</w:t>
+      </w:r>
+    </w:p>
+    <w:p>
+      <w:pPr>
+        <w:numPr>
+          <w:ilvl w:val="0"/>
+          <w:numId w:val="20"/>
         </w:numPr>
       </w:pPr>
       <w:r>
@@ -460,158 +1544,62 @@
           <w:b/>
           <w:bCs/>
         </w:rPr>
-        <w:t>Students</w:t>
-      </w:r>
-      <w:r>
-        <w:t>: read</w:t>
-      </w:r>
-      <w:r>
-        <w:noBreakHyphen/>
-        <w:t>only access to assignments and non</w:t>
-      </w:r>
-      <w:r>
-        <w:noBreakHyphen/>
-        <w:t>hidden test cases.</w:t>
+        <w:t>Lecturer Dashboard</w:t>
       </w:r>
     </w:p>
     <w:p>
       <w:pPr>
         <w:numPr>
           <w:ilvl w:val="1"/>
-          <w:numId w:val="7"/>
-        </w:numPr>
-      </w:pPr>
-      <w:r>
-        <w:t>This enforces business rules directly in the backend, preventing unauthorized actions.</w:t>
-      </w:r>
-    </w:p>
-    <w:p>
-      <w:pPr>
+          <w:numId w:val="20"/>
+        </w:numPr>
+      </w:pPr>
+      <w:r>
         <w:rPr>
           <w:b/>
           <w:bCs/>
         </w:rPr>
-      </w:pPr>
-      <w:r>
-        <w:rPr>
-          <w:b/>
-          <w:bCs/>
-        </w:rPr>
-        <w:t>8. Test Case Visibility Filter</w:t>
-      </w:r>
-    </w:p>
-    <w:p>
-      <w:pPr>
-        <w:numPr>
-          <w:ilvl w:val="0"/>
-          <w:numId w:val="8"/>
-        </w:numPr>
-      </w:pPr>
-      <w:r>
-        <w:t>Overrode get_</w:t>
-      </w:r>
-      <w:proofErr w:type="gramStart"/>
-      <w:r>
-        <w:t>queryset(</w:t>
-      </w:r>
-      <w:proofErr w:type="gramEnd"/>
-      <w:r>
-        <w:t>) in TestCaseViewSet so that students see only is_hidden=False test cases.</w:t>
-      </w:r>
-    </w:p>
-    <w:p>
-      <w:pPr>
-        <w:numPr>
-          <w:ilvl w:val="0"/>
-          <w:numId w:val="8"/>
-        </w:numPr>
-      </w:pPr>
-      <w:r>
-        <w:rPr>
-          <w:b/>
-          <w:bCs/>
-        </w:rPr>
-        <w:t>Why</w:t>
-      </w:r>
-      <w:r>
-        <w:t>: Lecturers can create “hidden” test cases (e.g., edge cases) that students can’t see, which helps prevent hard</w:t>
-      </w:r>
-      <w:r>
-        <w:noBreakHyphen/>
-        <w:t>coding and encourages robust solutions.</w:t>
-      </w:r>
-    </w:p>
-    <w:p>
-      <w:pPr>
-        <w:rPr>
-          <w:b/>
-          <w:bCs/>
-        </w:rPr>
-      </w:pPr>
-      <w:r>
-        <w:rPr>
-          <w:b/>
-          <w:bCs/>
-        </w:rPr>
-        <w:t>9. Testing with Postman</w:t>
-      </w:r>
-    </w:p>
-    <w:p>
-      <w:pPr>
-        <w:numPr>
-          <w:ilvl w:val="0"/>
-          <w:numId w:val="9"/>
-        </w:numPr>
-      </w:pPr>
-      <w:r>
-        <w:t>Used Postman to send HTTP requests and verify that all endpoints work as expected.</w:t>
-      </w:r>
-    </w:p>
-    <w:p>
-      <w:pPr>
-        <w:numPr>
-          <w:ilvl w:val="0"/>
-          <w:numId w:val="9"/>
-        </w:numPr>
-      </w:pPr>
-      <w:r>
-        <w:rPr>
-          <w:b/>
-          <w:bCs/>
-        </w:rPr>
-        <w:t>Why</w:t>
-      </w:r>
-      <w:r>
-        <w:t>: Postman lets us simulate the frontend before it’s built. We can ensure the API behaves correctly, check error responses, and validate permissions without a UI.</w:t>
-      </w:r>
-    </w:p>
-    <w:p>
-      <w:r>
-        <w:pict w14:anchorId="12C66DB0">
-          <v:rect id="_x0000_i1044" style="width:0;height:.75pt" o:hralign="center" o:hrstd="t" o:hr="t" fillcolor="#a0a0a0" stroked="f"/>
-        </w:pict>
-      </w:r>
-    </w:p>
-    <w:p>
-      <w:pPr>
-        <w:rPr>
-          <w:b/>
-          <w:bCs/>
-        </w:rPr>
-      </w:pPr>
-      <w:r>
-        <w:rPr>
-          <w:b/>
-          <w:bCs/>
-        </w:rPr>
-        <w:t>Why These Steps Matter for a Grading System</w:t>
-      </w:r>
-    </w:p>
-    <w:p>
-      <w:pPr>
-        <w:numPr>
-          <w:ilvl w:val="0"/>
-          <w:numId w:val="10"/>
+        <w:t>Assignments</w:t>
+      </w:r>
+      <w:r>
+        <w:t>:</w:t>
+      </w:r>
+    </w:p>
+    <w:p>
+      <w:pPr>
+        <w:numPr>
+          <w:ilvl w:val="2"/>
+          <w:numId w:val="20"/>
+        </w:numPr>
+      </w:pPr>
+      <w:r>
+        <w:t>Create/edit assignment (include </w:t>
+      </w:r>
+      <w:proofErr w:type="spellStart"/>
+      <w:r>
+        <w:t>grading_config</w:t>
+      </w:r>
+      <w:proofErr w:type="spellEnd"/>
+      <w:r>
+        <w:t> – weights, function requirements, etc.).</w:t>
+      </w:r>
+    </w:p>
+    <w:p>
+      <w:pPr>
+        <w:numPr>
+          <w:ilvl w:val="2"/>
+          <w:numId w:val="20"/>
+        </w:numPr>
+      </w:pPr>
+      <w:r>
+        <w:t>Delete assignment.</w:t>
+      </w:r>
+    </w:p>
+    <w:p>
+      <w:pPr>
+        <w:numPr>
+          <w:ilvl w:val="1"/>
+          <w:numId w:val="20"/>
         </w:numPr>
       </w:pPr>
       <w:r>
@@ -620,17 +1608,28 @@
           <w:bCs/>
         </w:rPr>
         <w:lastRenderedPageBreak/>
-        <w:t>Separation of concerns</w:t>
-      </w:r>
-      <w:r>
-        <w:t>: Backend handles data, authentication, and business logic; frontend will handle presentation.</w:t>
-      </w:r>
-    </w:p>
-    <w:p>
-      <w:pPr>
-        <w:numPr>
-          <w:ilvl w:val="0"/>
-          <w:numId w:val="10"/>
+        <w:t>Test Cases</w:t>
+      </w:r>
+      <w:r>
+        <w:t>:</w:t>
+      </w:r>
+    </w:p>
+    <w:p>
+      <w:pPr>
+        <w:numPr>
+          <w:ilvl w:val="2"/>
+          <w:numId w:val="20"/>
+        </w:numPr>
+      </w:pPr>
+      <w:r>
+        <w:t>Create/edit/delete test cases for an assignment, with a toggle for hidden.</w:t>
+      </w:r>
+    </w:p>
+    <w:p>
+      <w:pPr>
+        <w:numPr>
+          <w:ilvl w:val="1"/>
+          <w:numId w:val="20"/>
         </w:numPr>
       </w:pPr>
       <w:r>
@@ -638,17 +1637,39 @@
           <w:b/>
           <w:bCs/>
         </w:rPr>
-        <w:t>Scalability</w:t>
-      </w:r>
-      <w:r>
-        <w:t>: Using JWT and DRF viewsets makes the API easy to extend and maintain.</w:t>
-      </w:r>
-    </w:p>
-    <w:p>
-      <w:pPr>
-        <w:numPr>
-          <w:ilvl w:val="0"/>
-          <w:numId w:val="10"/>
+        <w:t>Submissions</w:t>
+      </w:r>
+      <w:r>
+        <w:t>:</w:t>
+      </w:r>
+    </w:p>
+    <w:p>
+      <w:pPr>
+        <w:numPr>
+          <w:ilvl w:val="2"/>
+          <w:numId w:val="20"/>
+        </w:numPr>
+      </w:pPr>
+      <w:r>
+        <w:t>View all submissions for an assignment (list with student names, grades).</w:t>
+      </w:r>
+    </w:p>
+    <w:p>
+      <w:pPr>
+        <w:numPr>
+          <w:ilvl w:val="2"/>
+          <w:numId w:val="20"/>
+        </w:numPr>
+      </w:pPr>
+      <w:r>
+        <w:t>Click on a submission to see the code and detailed feedback.</w:t>
+      </w:r>
+    </w:p>
+    <w:p>
+      <w:pPr>
+        <w:numPr>
+          <w:ilvl w:val="1"/>
+          <w:numId w:val="20"/>
         </w:numPr>
       </w:pPr>
       <w:r>
@@ -656,21 +1677,58 @@
           <w:b/>
           <w:bCs/>
         </w:rPr>
-        <w:t>Security</w:t>
-      </w:r>
-      <w:r>
-        <w:t>: Role</w:t>
-      </w:r>
-      <w:r>
-        <w:noBreakHyphen/>
-        <w:t>based permissions and hidden test cases protect the integrity of the assessment process.</w:t>
+        <w:t>Plagiarism</w:t>
+      </w:r>
+      <w:r>
+        <w:t>:</w:t>
+      </w:r>
+    </w:p>
+    <w:p>
+      <w:pPr>
+        <w:numPr>
+          <w:ilvl w:val="2"/>
+          <w:numId w:val="20"/>
+        </w:numPr>
+      </w:pPr>
+      <w:r>
+        <w:t>A button to trigger plagiarism check for an assignment (calls POST /</w:t>
+      </w:r>
+      <w:proofErr w:type="spellStart"/>
+      <w:r>
+        <w:t>api</w:t>
+      </w:r>
+      <w:proofErr w:type="spellEnd"/>
+      <w:r>
+        <w:t>/plagiarism/check/).</w:t>
+      </w:r>
+    </w:p>
+    <w:p>
+      <w:pPr>
+        <w:numPr>
+          <w:ilvl w:val="2"/>
+          <w:numId w:val="20"/>
+        </w:numPr>
+      </w:pPr>
+      <w:r>
+        <w:t>View a list of plagiarism reports for an assignment (similarity scores, links to the two submissions).</w:t>
+      </w:r>
+    </w:p>
+    <w:p>
+      <w:pPr>
+        <w:numPr>
+          <w:ilvl w:val="2"/>
+          <w:numId w:val="20"/>
+        </w:numPr>
+      </w:pPr>
+      <w:r>
+        <w:t>Mark reports as reviewed or add notes.</w:t>
       </w:r>
     </w:p>
     <w:p>
       <w:pPr>
         <w:numPr>
           <w:ilvl w:val="0"/>
-          <w:numId w:val="10"/>
+          <w:numId w:val="20"/>
         </w:numPr>
       </w:pPr>
       <w:r>
@@ -678,16 +1736,58 @@
           <w:b/>
           <w:bCs/>
         </w:rPr>
-        <w:t>Ease of development</w:t>
-      </w:r>
-      <w:r>
-        <w:t>: With the admin panel and Postman, we can test quickly and fix issues early.</w:t>
-      </w:r>
-    </w:p>
-    <w:p>
-      <w:r>
-        <w:pict w14:anchorId="616AB554">
-          <v:rect id="_x0000_i1045" style="width:0;height:.75pt" o:hralign="center" o:hrstd="t" o:hr="t" fillcolor="#a0a0a0" stroked="f"/>
+        <w:t>General</w:t>
+      </w:r>
+    </w:p>
+    <w:p>
+      <w:pPr>
+        <w:numPr>
+          <w:ilvl w:val="1"/>
+          <w:numId w:val="20"/>
+        </w:numPr>
+      </w:pPr>
+      <w:r>
+        <w:t>Use the API documentation I provided as the reference for all endpoints.</w:t>
+      </w:r>
+    </w:p>
+    <w:p>
+      <w:pPr>
+        <w:numPr>
+          <w:ilvl w:val="1"/>
+          <w:numId w:val="20"/>
+        </w:numPr>
+      </w:pPr>
+      <w:r>
+        <w:t>Use </w:t>
+      </w:r>
+      <w:proofErr w:type="spellStart"/>
+      <w:r>
+        <w:t>axios</w:t>
+      </w:r>
+      <w:proofErr w:type="spellEnd"/>
+      <w:r>
+        <w:t> or fetch with interceptors to handle tokens.</w:t>
+      </w:r>
+    </w:p>
+    <w:p>
+      <w:pPr>
+        <w:numPr>
+          <w:ilvl w:val="1"/>
+          <w:numId w:val="20"/>
+        </w:numPr>
+      </w:pPr>
+      <w:r>
+        <w:t>Implement role</w:t>
+      </w:r>
+      <w:r>
+        <w:noBreakHyphen/>
+        <w:t>based routing (e.g., /lecturer routes are only accessible by lecturers).</w:t>
+      </w:r>
+    </w:p>
+    <w:p>
+      <w:r>
+        <w:pict w14:anchorId="140533FE">
+          <v:rect id="_x0000_i1051" style="width:0;height:.75pt" o:hralign="center" o:hrstd="t" o:hr="t" fillcolor="#a0a0a0" stroked="f"/>
         </w:pict>
       </w:r>
     </w:p>
@@ -703,28 +1803,76 @@
           <w:b/>
           <w:bCs/>
         </w:rPr>
-        <w:t>What’s Next – Feature 3: Submissions &amp; Grading</w:t>
-      </w:r>
-    </w:p>
-    <w:p>
-      <w:r>
-        <w:t>Now that we have assignments and test cases, we need to allow students to submit code and have it graded automatically.</w:t>
-      </w:r>
-    </w:p>
-    <w:p>
+        <w:t>Next Steps</w:t>
+      </w:r>
+    </w:p>
+    <w:p>
+      <w:pPr>
+        <w:numPr>
+          <w:ilvl w:val="0"/>
+          <w:numId w:val="21"/>
+        </w:numPr>
+      </w:pPr>
       <w:r>
         <w:rPr>
           <w:b/>
           <w:bCs/>
         </w:rPr>
-        <w:t>Planned steps:</w:t>
+        <w:t>You (lead backend)</w:t>
+      </w:r>
+      <w:r>
+        <w:t> –</w:t>
+      </w:r>
+    </w:p>
+    <w:p>
+      <w:pPr>
+        <w:numPr>
+          <w:ilvl w:val="1"/>
+          <w:numId w:val="21"/>
+        </w:numPr>
+      </w:pPr>
+      <w:r>
+        <w:t>Clean up any duplicate code in grading.py (the function appeared twice).</w:t>
+      </w:r>
+    </w:p>
+    <w:p>
+      <w:pPr>
+        <w:numPr>
+          <w:ilvl w:val="1"/>
+          <w:numId w:val="21"/>
+        </w:numPr>
+      </w:pPr>
+      <w:r>
+        <w:t>Ensure the AI feedback works (set GEMINI_API_KEY in your environment).</w:t>
+      </w:r>
+    </w:p>
+    <w:p>
+      <w:pPr>
+        <w:numPr>
+          <w:ilvl w:val="1"/>
+          <w:numId w:val="21"/>
+        </w:numPr>
+      </w:pPr>
+      <w:r>
+        <w:t>Help integrate the plagiarism module when it’s ready.</w:t>
+      </w:r>
+    </w:p>
+    <w:p>
+      <w:pPr>
+        <w:numPr>
+          <w:ilvl w:val="1"/>
+          <w:numId w:val="21"/>
+        </w:numPr>
+      </w:pPr>
+      <w:r>
+        <w:t>Prepare for deployment (e.g., switch to PostgreSQL, serve media files).</w:t>
       </w:r>
     </w:p>
     <w:p>
       <w:pPr>
         <w:numPr>
           <w:ilvl w:val="0"/>
-          <w:numId w:val="11"/>
+          <w:numId w:val="21"/>
         </w:numPr>
       </w:pPr>
       <w:r>
@@ -732,97 +1880,28 @@
           <w:b/>
           <w:bCs/>
         </w:rPr>
-        <w:t>Create a </w:t>
-      </w:r>
-      <w:r>
-        <w:t>Submission</w:t>
-      </w:r>
+        <w:t>Plagiarism backend developer</w:t>
+      </w:r>
+      <w:r>
+        <w:t> – start building the module as described. Ask if you need any clarification about the existing models or storage.</w:t>
+      </w:r>
+    </w:p>
+    <w:p>
+      <w:pPr>
+        <w:numPr>
+          <w:ilvl w:val="0"/>
+          <w:numId w:val="21"/>
+        </w:numPr>
+      </w:pPr>
       <w:r>
         <w:rPr>
           <w:b/>
           <w:bCs/>
         </w:rPr>
-        <w:t> model</w:t>
-      </w:r>
-      <w:r>
-        <w:t> – stores the student’s code file, the assignment it belongs to, submission time, grade, and feedback.</w:t>
-      </w:r>
-    </w:p>
-    <w:p>
-      <w:pPr>
-        <w:numPr>
-          <w:ilvl w:val="0"/>
-          <w:numId w:val="11"/>
-        </w:numPr>
-      </w:pPr>
-      <w:r>
-        <w:rPr>
-          <w:b/>
-          <w:bCs/>
-        </w:rPr>
-        <w:t>Build file upload API</w:t>
-      </w:r>
-      <w:r>
-        <w:t> – students can POST a .py file to /api/submissions/.</w:t>
-      </w:r>
-    </w:p>
-    <w:p>
-      <w:pPr>
-        <w:numPr>
-          <w:ilvl w:val="0"/>
-          <w:numId w:val="11"/>
-        </w:numPr>
-      </w:pPr>
-      <w:r>
-        <w:rPr>
-          <w:b/>
-          <w:bCs/>
-        </w:rPr>
-        <w:t>Write code execution function</w:t>
-      </w:r>
-      <w:r>
-        <w:t> – runs the submitted code against the assignment’s test cases (in a sandboxed environment) and calculates a score.</w:t>
-      </w:r>
-    </w:p>
-    <w:p>
-      <w:pPr>
-        <w:numPr>
-          <w:ilvl w:val="0"/>
-          <w:numId w:val="11"/>
-        </w:numPr>
-      </w:pPr>
-      <w:r>
-        <w:rPr>
-          <w:b/>
-          <w:bCs/>
-        </w:rPr>
-        <w:t>Store results</w:t>
-      </w:r>
-      <w:r>
-        <w:t> – save the grade and detailed test results (which test passed/failed).</w:t>
-      </w:r>
-    </w:p>
-    <w:p>
-      <w:pPr>
-        <w:numPr>
-          <w:ilvl w:val="0"/>
-          <w:numId w:val="11"/>
-        </w:numPr>
-      </w:pPr>
-      <w:r>
-        <w:rPr>
-          <w:b/>
-          <w:bCs/>
-        </w:rPr>
-        <w:t>Provide feedback</w:t>
-      </w:r>
-      <w:r>
-        <w:t> – return the test results and possibly style suggestions (e.g., using pylint).</w:t>
-      </w:r>
-    </w:p>
-    <w:p>
-      <w:r>
-        <w:t>Once this is done, we’ll have a fully functional prototype for grading. Then we can add plagiarism detection and AI feedback.</w:t>
+        <w:t>Frontend team</w:t>
+      </w:r>
+      <w:r>
+        <w:t> – begin with the authentication pages and assignment listing. Coordinate with me for any missing endpoints or clarifications.</w:t>
       </w:r>
     </w:p>
     <w:p/>
@@ -839,6 +1918,155 @@
 <file path=word/numbering.xml><?xml version="1.0" encoding="utf-8"?>
 <w:numbering xmlns:wpc="http://schemas.microsoft.com/office/word/2010/wordprocessingCanvas" xmlns:cx="http://schemas.microsoft.com/office/drawing/2014/chartex" xmlns:cx1="http://schemas.microsoft.com/office/drawing/2015/9/8/chartex" xmlns:cx2="http://schemas.microsoft.com/office/drawing/2015/10/21/chartex" xmlns:cx3="http://schemas.microsoft.com/office/drawing/2016/5/9/chartex" xmlns:cx4="http://schemas.microsoft.com/office/drawing/2016/5/10/chartex" xmlns:cx5="http://schemas.microsoft.com/office/drawing/2016/5/11/chartex" xmlns:cx6="http://schemas.microsoft.com/office/drawing/2016/5/12/chartex" xmlns:cx7="http://schemas.microsoft.com/office/drawing/2016/5/13/chartex" xmlns:cx8="http://schemas.microsoft.com/office/drawing/2016/5/14/chartex" xmlns:mc="http://schemas.openxmlformats.org/markup-compatibility/2006" xmlns:aink="http://schemas.microsoft.com/office/drawing/2016/ink" xmlns:am3d="http://schemas.microsoft.com/office/drawing/2017/model3d" xmlns:o="urn:schemas-microsoft-com:office:office" xmlns:oel="http://schemas.microsoft.com/office/2019/extlst" xmlns:r="http://schemas.openxmlformats.org/officeDocument/2006/relationships" xmlns:m="http://schemas.openxmlformats.org/officeDocument/2006/math" xmlns:v="urn:schemas-microsoft-com:vml" xmlns:wp14="http://schemas.microsoft.com/office/word/2010/wordprocessingDrawing" xmlns:wp="http://schemas.openxmlformats.org/drawingml/2006/wordprocessingDrawing" xmlns:w10="urn:schemas-microsoft-com:office:word" xmlns:w="http://schemas.openxmlformats.org/wordprocessingml/2006/main" xmlns:w14="http://schemas.microsoft.com/office/word/2010/wordml" xmlns:w15="http://schemas.microsoft.com/office/word/2012/wordml" xmlns:w16cex="http://schemas.microsoft.com/office/word/2018/wordml/cex" xmlns:w16cid="http://schemas.microsoft.com/office/word/2016/wordml/cid" xmlns:w16="http://schemas.microsoft.com/office/word/2018/wordml" xmlns:w16du="http://schemas.microsoft.com/office/word/2023/wordml/word16du" xmlns:w16sdtdh="http://schemas.microsoft.com/office/word/2020/wordml/sdtdatahash" xmlns:w16sdtfl="http://schemas.microsoft.com/office/word/2024/wordml/sdtformatlock" xmlns:w16se="http://schemas.microsoft.com/office/word/2015/wordml/symex" xmlns:wpg="http://schemas.microsoft.com/office/word/2010/wordprocessingGroup" xmlns:wpi="http://schemas.microsoft.com/office/word/2010/wordprocessingInk" xmlns:wne="http://schemas.microsoft.com/office/word/2006/wordml" xmlns:wps="http://schemas.microsoft.com/office/word/2010/wordprocessingShape" mc:Ignorable="w14 w15 w16se w16cid w16 w16cex w16sdtdh w16sdtfl w16du wp14">
   <w:abstractNum w:abstractNumId="0" w15:restartNumberingAfterBreak="0">
+    <w:nsid w:val="015830AB"/>
+    <w:multiLevelType w:val="multilevel"/>
+    <w:tmpl w:val="9EB4E2B2"/>
+    <w:lvl w:ilvl="0">
+      <w:start w:val="1"/>
+      <w:numFmt w:val="bullet"/>
+      <w:lvlText w:val=""/>
+      <w:lvlJc w:val="left"/>
+      <w:pPr>
+        <w:tabs>
+          <w:tab w:val="num" w:pos="720"/>
+        </w:tabs>
+        <w:ind w:left="720" w:hanging="360"/>
+      </w:pPr>
+      <w:rPr>
+        <w:rFonts w:ascii="Symbol" w:hAnsi="Symbol" w:hint="default"/>
+        <w:sz w:val="20"/>
+      </w:rPr>
+    </w:lvl>
+    <w:lvl w:ilvl="1" w:tentative="1">
+      <w:start w:val="1"/>
+      <w:numFmt w:val="bullet"/>
+      <w:lvlText w:val="o"/>
+      <w:lvlJc w:val="left"/>
+      <w:pPr>
+        <w:tabs>
+          <w:tab w:val="num" w:pos="1440"/>
+        </w:tabs>
+        <w:ind w:left="1440" w:hanging="360"/>
+      </w:pPr>
+      <w:rPr>
+        <w:rFonts w:ascii="Courier New" w:hAnsi="Courier New" w:hint="default"/>
+        <w:sz w:val="20"/>
+      </w:rPr>
+    </w:lvl>
+    <w:lvl w:ilvl="2" w:tentative="1">
+      <w:start w:val="1"/>
+      <w:numFmt w:val="bullet"/>
+      <w:lvlText w:val=""/>
+      <w:lvlJc w:val="left"/>
+      <w:pPr>
+        <w:tabs>
+          <w:tab w:val="num" w:pos="2160"/>
+        </w:tabs>
+        <w:ind w:left="2160" w:hanging="360"/>
+      </w:pPr>
+      <w:rPr>
+        <w:rFonts w:ascii="Wingdings" w:hAnsi="Wingdings" w:hint="default"/>
+        <w:sz w:val="20"/>
+      </w:rPr>
+    </w:lvl>
+    <w:lvl w:ilvl="3" w:tentative="1">
+      <w:start w:val="1"/>
+      <w:numFmt w:val="bullet"/>
+      <w:lvlText w:val=""/>
+      <w:lvlJc w:val="left"/>
+      <w:pPr>
+        <w:tabs>
+          <w:tab w:val="num" w:pos="2880"/>
+        </w:tabs>
+        <w:ind w:left="2880" w:hanging="360"/>
+      </w:pPr>
+      <w:rPr>
+        <w:rFonts w:ascii="Wingdings" w:hAnsi="Wingdings" w:hint="default"/>
+        <w:sz w:val="20"/>
+      </w:rPr>
+    </w:lvl>
+    <w:lvl w:ilvl="4" w:tentative="1">
+      <w:start w:val="1"/>
+      <w:numFmt w:val="bullet"/>
+      <w:lvlText w:val=""/>
+      <w:lvlJc w:val="left"/>
+      <w:pPr>
+        <w:tabs>
+          <w:tab w:val="num" w:pos="3600"/>
+        </w:tabs>
+        <w:ind w:left="3600" w:hanging="360"/>
+      </w:pPr>
+      <w:rPr>
+        <w:rFonts w:ascii="Wingdings" w:hAnsi="Wingdings" w:hint="default"/>
+        <w:sz w:val="20"/>
+      </w:rPr>
+    </w:lvl>
+    <w:lvl w:ilvl="5" w:tentative="1">
+      <w:start w:val="1"/>
+      <w:numFmt w:val="bullet"/>
+      <w:lvlText w:val=""/>
+      <w:lvlJc w:val="left"/>
+      <w:pPr>
+        <w:tabs>
+          <w:tab w:val="num" w:pos="4320"/>
+        </w:tabs>
+        <w:ind w:left="4320" w:hanging="360"/>
+      </w:pPr>
+      <w:rPr>
+        <w:rFonts w:ascii="Wingdings" w:hAnsi="Wingdings" w:hint="default"/>
+        <w:sz w:val="20"/>
+      </w:rPr>
+    </w:lvl>
+    <w:lvl w:ilvl="6" w:tentative="1">
+      <w:start w:val="1"/>
+      <w:numFmt w:val="bullet"/>
+      <w:lvlText w:val=""/>
+      <w:lvlJc w:val="left"/>
+      <w:pPr>
+        <w:tabs>
+          <w:tab w:val="num" w:pos="5040"/>
+        </w:tabs>
+        <w:ind w:left="5040" w:hanging="360"/>
+      </w:pPr>
+      <w:rPr>
+        <w:rFonts w:ascii="Wingdings" w:hAnsi="Wingdings" w:hint="default"/>
+        <w:sz w:val="20"/>
+      </w:rPr>
+    </w:lvl>
+    <w:lvl w:ilvl="7" w:tentative="1">
+      <w:start w:val="1"/>
+      <w:numFmt w:val="bullet"/>
+      <w:lvlText w:val=""/>
+      <w:lvlJc w:val="left"/>
+      <w:pPr>
+        <w:tabs>
+          <w:tab w:val="num" w:pos="5760"/>
+        </w:tabs>
+        <w:ind w:left="5760" w:hanging="360"/>
+      </w:pPr>
+      <w:rPr>
+        <w:rFonts w:ascii="Wingdings" w:hAnsi="Wingdings" w:hint="default"/>
+        <w:sz w:val="20"/>
+      </w:rPr>
+    </w:lvl>
+    <w:lvl w:ilvl="8" w:tentative="1">
+      <w:start w:val="1"/>
+      <w:numFmt w:val="bullet"/>
+      <w:lvlText w:val=""/>
+      <w:lvlJc w:val="left"/>
+      <w:pPr>
+        <w:tabs>
+          <w:tab w:val="num" w:pos="6480"/>
+        </w:tabs>
+        <w:ind w:left="6480" w:hanging="360"/>
+      </w:pPr>
+      <w:rPr>
+        <w:rFonts w:ascii="Wingdings" w:hAnsi="Wingdings" w:hint="default"/>
+        <w:sz w:val="20"/>
+      </w:rPr>
+    </w:lvl>
+  </w:abstractNum>
+  <w:abstractNum w:abstractNumId="1" w15:restartNumberingAfterBreak="0">
     <w:nsid w:val="01C46692"/>
     <w:multiLevelType w:val="multilevel"/>
     <w:tmpl w:val="773E25A0"/>
@@ -987,7 +2215,305 @@
       </w:rPr>
     </w:lvl>
   </w:abstractNum>
-  <w:abstractNum w:abstractNumId="1" w15:restartNumberingAfterBreak="0">
+  <w:abstractNum w:abstractNumId="2" w15:restartNumberingAfterBreak="0">
+    <w:nsid w:val="06871B4F"/>
+    <w:multiLevelType w:val="multilevel"/>
+    <w:tmpl w:val="940AB1C8"/>
+    <w:lvl w:ilvl="0">
+      <w:start w:val="1"/>
+      <w:numFmt w:val="bullet"/>
+      <w:lvlText w:val=""/>
+      <w:lvlJc w:val="left"/>
+      <w:pPr>
+        <w:tabs>
+          <w:tab w:val="num" w:pos="720"/>
+        </w:tabs>
+        <w:ind w:left="720" w:hanging="360"/>
+      </w:pPr>
+      <w:rPr>
+        <w:rFonts w:ascii="Symbol" w:hAnsi="Symbol" w:hint="default"/>
+        <w:sz w:val="20"/>
+      </w:rPr>
+    </w:lvl>
+    <w:lvl w:ilvl="1">
+      <w:start w:val="1"/>
+      <w:numFmt w:val="bullet"/>
+      <w:lvlText w:val="o"/>
+      <w:lvlJc w:val="left"/>
+      <w:pPr>
+        <w:tabs>
+          <w:tab w:val="num" w:pos="1440"/>
+        </w:tabs>
+        <w:ind w:left="1440" w:hanging="360"/>
+      </w:pPr>
+      <w:rPr>
+        <w:rFonts w:ascii="Courier New" w:hAnsi="Courier New" w:hint="default"/>
+        <w:sz w:val="20"/>
+      </w:rPr>
+    </w:lvl>
+    <w:lvl w:ilvl="2">
+      <w:start w:val="1"/>
+      <w:numFmt w:val="bullet"/>
+      <w:lvlText w:val=""/>
+      <w:lvlJc w:val="left"/>
+      <w:pPr>
+        <w:tabs>
+          <w:tab w:val="num" w:pos="2160"/>
+        </w:tabs>
+        <w:ind w:left="2160" w:hanging="360"/>
+      </w:pPr>
+      <w:rPr>
+        <w:rFonts w:ascii="Wingdings" w:hAnsi="Wingdings" w:hint="default"/>
+        <w:sz w:val="20"/>
+      </w:rPr>
+    </w:lvl>
+    <w:lvl w:ilvl="3" w:tentative="1">
+      <w:start w:val="1"/>
+      <w:numFmt w:val="bullet"/>
+      <w:lvlText w:val=""/>
+      <w:lvlJc w:val="left"/>
+      <w:pPr>
+        <w:tabs>
+          <w:tab w:val="num" w:pos="2880"/>
+        </w:tabs>
+        <w:ind w:left="2880" w:hanging="360"/>
+      </w:pPr>
+      <w:rPr>
+        <w:rFonts w:ascii="Wingdings" w:hAnsi="Wingdings" w:hint="default"/>
+        <w:sz w:val="20"/>
+      </w:rPr>
+    </w:lvl>
+    <w:lvl w:ilvl="4" w:tentative="1">
+      <w:start w:val="1"/>
+      <w:numFmt w:val="bullet"/>
+      <w:lvlText w:val=""/>
+      <w:lvlJc w:val="left"/>
+      <w:pPr>
+        <w:tabs>
+          <w:tab w:val="num" w:pos="3600"/>
+        </w:tabs>
+        <w:ind w:left="3600" w:hanging="360"/>
+      </w:pPr>
+      <w:rPr>
+        <w:rFonts w:ascii="Wingdings" w:hAnsi="Wingdings" w:hint="default"/>
+        <w:sz w:val="20"/>
+      </w:rPr>
+    </w:lvl>
+    <w:lvl w:ilvl="5" w:tentative="1">
+      <w:start w:val="1"/>
+      <w:numFmt w:val="bullet"/>
+      <w:lvlText w:val=""/>
+      <w:lvlJc w:val="left"/>
+      <w:pPr>
+        <w:tabs>
+          <w:tab w:val="num" w:pos="4320"/>
+        </w:tabs>
+        <w:ind w:left="4320" w:hanging="360"/>
+      </w:pPr>
+      <w:rPr>
+        <w:rFonts w:ascii="Wingdings" w:hAnsi="Wingdings" w:hint="default"/>
+        <w:sz w:val="20"/>
+      </w:rPr>
+    </w:lvl>
+    <w:lvl w:ilvl="6" w:tentative="1">
+      <w:start w:val="1"/>
+      <w:numFmt w:val="bullet"/>
+      <w:lvlText w:val=""/>
+      <w:lvlJc w:val="left"/>
+      <w:pPr>
+        <w:tabs>
+          <w:tab w:val="num" w:pos="5040"/>
+        </w:tabs>
+        <w:ind w:left="5040" w:hanging="360"/>
+      </w:pPr>
+      <w:rPr>
+        <w:rFonts w:ascii="Wingdings" w:hAnsi="Wingdings" w:hint="default"/>
+        <w:sz w:val="20"/>
+      </w:rPr>
+    </w:lvl>
+    <w:lvl w:ilvl="7" w:tentative="1">
+      <w:start w:val="1"/>
+      <w:numFmt w:val="bullet"/>
+      <w:lvlText w:val=""/>
+      <w:lvlJc w:val="left"/>
+      <w:pPr>
+        <w:tabs>
+          <w:tab w:val="num" w:pos="5760"/>
+        </w:tabs>
+        <w:ind w:left="5760" w:hanging="360"/>
+      </w:pPr>
+      <w:rPr>
+        <w:rFonts w:ascii="Wingdings" w:hAnsi="Wingdings" w:hint="default"/>
+        <w:sz w:val="20"/>
+      </w:rPr>
+    </w:lvl>
+    <w:lvl w:ilvl="8" w:tentative="1">
+      <w:start w:val="1"/>
+      <w:numFmt w:val="bullet"/>
+      <w:lvlText w:val=""/>
+      <w:lvlJc w:val="left"/>
+      <w:pPr>
+        <w:tabs>
+          <w:tab w:val="num" w:pos="6480"/>
+        </w:tabs>
+        <w:ind w:left="6480" w:hanging="360"/>
+      </w:pPr>
+      <w:rPr>
+        <w:rFonts w:ascii="Wingdings" w:hAnsi="Wingdings" w:hint="default"/>
+        <w:sz w:val="20"/>
+      </w:rPr>
+    </w:lvl>
+  </w:abstractNum>
+  <w:abstractNum w:abstractNumId="3" w15:restartNumberingAfterBreak="0">
+    <w:nsid w:val="0E7A137B"/>
+    <w:multiLevelType w:val="multilevel"/>
+    <w:tmpl w:val="0DFA6A70"/>
+    <w:lvl w:ilvl="0">
+      <w:start w:val="1"/>
+      <w:numFmt w:val="bullet"/>
+      <w:lvlText w:val=""/>
+      <w:lvlJc w:val="left"/>
+      <w:pPr>
+        <w:tabs>
+          <w:tab w:val="num" w:pos="720"/>
+        </w:tabs>
+        <w:ind w:left="720" w:hanging="360"/>
+      </w:pPr>
+      <w:rPr>
+        <w:rFonts w:ascii="Symbol" w:hAnsi="Symbol" w:hint="default"/>
+        <w:sz w:val="20"/>
+      </w:rPr>
+    </w:lvl>
+    <w:lvl w:ilvl="1">
+      <w:start w:val="1"/>
+      <w:numFmt w:val="bullet"/>
+      <w:lvlText w:val="o"/>
+      <w:lvlJc w:val="left"/>
+      <w:pPr>
+        <w:tabs>
+          <w:tab w:val="num" w:pos="1440"/>
+        </w:tabs>
+        <w:ind w:left="1440" w:hanging="360"/>
+      </w:pPr>
+      <w:rPr>
+        <w:rFonts w:ascii="Courier New" w:hAnsi="Courier New" w:hint="default"/>
+        <w:sz w:val="20"/>
+      </w:rPr>
+    </w:lvl>
+    <w:lvl w:ilvl="2">
+      <w:start w:val="1"/>
+      <w:numFmt w:val="bullet"/>
+      <w:lvlText w:val=""/>
+      <w:lvlJc w:val="left"/>
+      <w:pPr>
+        <w:tabs>
+          <w:tab w:val="num" w:pos="2160"/>
+        </w:tabs>
+        <w:ind w:left="2160" w:hanging="360"/>
+      </w:pPr>
+      <w:rPr>
+        <w:rFonts w:ascii="Wingdings" w:hAnsi="Wingdings" w:hint="default"/>
+        <w:sz w:val="20"/>
+      </w:rPr>
+    </w:lvl>
+    <w:lvl w:ilvl="3" w:tentative="1">
+      <w:start w:val="1"/>
+      <w:numFmt w:val="bullet"/>
+      <w:lvlText w:val=""/>
+      <w:lvlJc w:val="left"/>
+      <w:pPr>
+        <w:tabs>
+          <w:tab w:val="num" w:pos="2880"/>
+        </w:tabs>
+        <w:ind w:left="2880" w:hanging="360"/>
+      </w:pPr>
+      <w:rPr>
+        <w:rFonts w:ascii="Wingdings" w:hAnsi="Wingdings" w:hint="default"/>
+        <w:sz w:val="20"/>
+      </w:rPr>
+    </w:lvl>
+    <w:lvl w:ilvl="4" w:tentative="1">
+      <w:start w:val="1"/>
+      <w:numFmt w:val="bullet"/>
+      <w:lvlText w:val=""/>
+      <w:lvlJc w:val="left"/>
+      <w:pPr>
+        <w:tabs>
+          <w:tab w:val="num" w:pos="3600"/>
+        </w:tabs>
+        <w:ind w:left="3600" w:hanging="360"/>
+      </w:pPr>
+      <w:rPr>
+        <w:rFonts w:ascii="Wingdings" w:hAnsi="Wingdings" w:hint="default"/>
+        <w:sz w:val="20"/>
+      </w:rPr>
+    </w:lvl>
+    <w:lvl w:ilvl="5" w:tentative="1">
+      <w:start w:val="1"/>
+      <w:numFmt w:val="bullet"/>
+      <w:lvlText w:val=""/>
+      <w:lvlJc w:val="left"/>
+      <w:pPr>
+        <w:tabs>
+          <w:tab w:val="num" w:pos="4320"/>
+        </w:tabs>
+        <w:ind w:left="4320" w:hanging="360"/>
+      </w:pPr>
+      <w:rPr>
+        <w:rFonts w:ascii="Wingdings" w:hAnsi="Wingdings" w:hint="default"/>
+        <w:sz w:val="20"/>
+      </w:rPr>
+    </w:lvl>
+    <w:lvl w:ilvl="6" w:tentative="1">
+      <w:start w:val="1"/>
+      <w:numFmt w:val="bullet"/>
+      <w:lvlText w:val=""/>
+      <w:lvlJc w:val="left"/>
+      <w:pPr>
+        <w:tabs>
+          <w:tab w:val="num" w:pos="5040"/>
+        </w:tabs>
+        <w:ind w:left="5040" w:hanging="360"/>
+      </w:pPr>
+      <w:rPr>
+        <w:rFonts w:ascii="Wingdings" w:hAnsi="Wingdings" w:hint="default"/>
+        <w:sz w:val="20"/>
+      </w:rPr>
+    </w:lvl>
+    <w:lvl w:ilvl="7" w:tentative="1">
+      <w:start w:val="1"/>
+      <w:numFmt w:val="bullet"/>
+      <w:lvlText w:val=""/>
+      <w:lvlJc w:val="left"/>
+      <w:pPr>
+        <w:tabs>
+          <w:tab w:val="num" w:pos="5760"/>
+        </w:tabs>
+        <w:ind w:left="5760" w:hanging="360"/>
+      </w:pPr>
+      <w:rPr>
+        <w:rFonts w:ascii="Wingdings" w:hAnsi="Wingdings" w:hint="default"/>
+        <w:sz w:val="20"/>
+      </w:rPr>
+    </w:lvl>
+    <w:lvl w:ilvl="8" w:tentative="1">
+      <w:start w:val="1"/>
+      <w:numFmt w:val="bullet"/>
+      <w:lvlText w:val=""/>
+      <w:lvlJc w:val="left"/>
+      <w:pPr>
+        <w:tabs>
+          <w:tab w:val="num" w:pos="6480"/>
+        </w:tabs>
+        <w:ind w:left="6480" w:hanging="360"/>
+      </w:pPr>
+      <w:rPr>
+        <w:rFonts w:ascii="Wingdings" w:hAnsi="Wingdings" w:hint="default"/>
+        <w:sz w:val="20"/>
+      </w:rPr>
+    </w:lvl>
+  </w:abstractNum>
+  <w:abstractNum w:abstractNumId="4" w15:restartNumberingAfterBreak="0">
     <w:nsid w:val="125E4D7F"/>
     <w:multiLevelType w:val="multilevel"/>
     <w:tmpl w:val="96EC7F10"/>
@@ -1100,7 +2626,7 @@
       </w:pPr>
     </w:lvl>
   </w:abstractNum>
-  <w:abstractNum w:abstractNumId="2" w15:restartNumberingAfterBreak="0">
+  <w:abstractNum w:abstractNumId="5" w15:restartNumberingAfterBreak="0">
     <w:nsid w:val="12853104"/>
     <w:multiLevelType w:val="multilevel"/>
     <w:tmpl w:val="3E442E0A"/>
@@ -1249,7 +2775,7 @@
       </w:rPr>
     </w:lvl>
   </w:abstractNum>
-  <w:abstractNum w:abstractNumId="3" w15:restartNumberingAfterBreak="0">
+  <w:abstractNum w:abstractNumId="6" w15:restartNumberingAfterBreak="0">
     <w:nsid w:val="25902EAC"/>
     <w:multiLevelType w:val="multilevel"/>
     <w:tmpl w:val="4E183F38"/>
@@ -1398,7 +2924,156 @@
       </w:rPr>
     </w:lvl>
   </w:abstractNum>
-  <w:abstractNum w:abstractNumId="4" w15:restartNumberingAfterBreak="0">
+  <w:abstractNum w:abstractNumId="7" w15:restartNumberingAfterBreak="0">
+    <w:nsid w:val="2B495B62"/>
+    <w:multiLevelType w:val="multilevel"/>
+    <w:tmpl w:val="F954C7E0"/>
+    <w:lvl w:ilvl="0">
+      <w:start w:val="1"/>
+      <w:numFmt w:val="bullet"/>
+      <w:lvlText w:val=""/>
+      <w:lvlJc w:val="left"/>
+      <w:pPr>
+        <w:tabs>
+          <w:tab w:val="num" w:pos="720"/>
+        </w:tabs>
+        <w:ind w:left="720" w:hanging="360"/>
+      </w:pPr>
+      <w:rPr>
+        <w:rFonts w:ascii="Symbol" w:hAnsi="Symbol" w:hint="default"/>
+        <w:sz w:val="20"/>
+      </w:rPr>
+    </w:lvl>
+    <w:lvl w:ilvl="1" w:tentative="1">
+      <w:start w:val="1"/>
+      <w:numFmt w:val="bullet"/>
+      <w:lvlText w:val="o"/>
+      <w:lvlJc w:val="left"/>
+      <w:pPr>
+        <w:tabs>
+          <w:tab w:val="num" w:pos="1440"/>
+        </w:tabs>
+        <w:ind w:left="1440" w:hanging="360"/>
+      </w:pPr>
+      <w:rPr>
+        <w:rFonts w:ascii="Courier New" w:hAnsi="Courier New" w:hint="default"/>
+        <w:sz w:val="20"/>
+      </w:rPr>
+    </w:lvl>
+    <w:lvl w:ilvl="2" w:tentative="1">
+      <w:start w:val="1"/>
+      <w:numFmt w:val="bullet"/>
+      <w:lvlText w:val=""/>
+      <w:lvlJc w:val="left"/>
+      <w:pPr>
+        <w:tabs>
+          <w:tab w:val="num" w:pos="2160"/>
+        </w:tabs>
+        <w:ind w:left="2160" w:hanging="360"/>
+      </w:pPr>
+      <w:rPr>
+        <w:rFonts w:ascii="Wingdings" w:hAnsi="Wingdings" w:hint="default"/>
+        <w:sz w:val="20"/>
+      </w:rPr>
+    </w:lvl>
+    <w:lvl w:ilvl="3" w:tentative="1">
+      <w:start w:val="1"/>
+      <w:numFmt w:val="bullet"/>
+      <w:lvlText w:val=""/>
+      <w:lvlJc w:val="left"/>
+      <w:pPr>
+        <w:tabs>
+          <w:tab w:val="num" w:pos="2880"/>
+        </w:tabs>
+        <w:ind w:left="2880" w:hanging="360"/>
+      </w:pPr>
+      <w:rPr>
+        <w:rFonts w:ascii="Wingdings" w:hAnsi="Wingdings" w:hint="default"/>
+        <w:sz w:val="20"/>
+      </w:rPr>
+    </w:lvl>
+    <w:lvl w:ilvl="4" w:tentative="1">
+      <w:start w:val="1"/>
+      <w:numFmt w:val="bullet"/>
+      <w:lvlText w:val=""/>
+      <w:lvlJc w:val="left"/>
+      <w:pPr>
+        <w:tabs>
+          <w:tab w:val="num" w:pos="3600"/>
+        </w:tabs>
+        <w:ind w:left="3600" w:hanging="360"/>
+      </w:pPr>
+      <w:rPr>
+        <w:rFonts w:ascii="Wingdings" w:hAnsi="Wingdings" w:hint="default"/>
+        <w:sz w:val="20"/>
+      </w:rPr>
+    </w:lvl>
+    <w:lvl w:ilvl="5" w:tentative="1">
+      <w:start w:val="1"/>
+      <w:numFmt w:val="bullet"/>
+      <w:lvlText w:val=""/>
+      <w:lvlJc w:val="left"/>
+      <w:pPr>
+        <w:tabs>
+          <w:tab w:val="num" w:pos="4320"/>
+        </w:tabs>
+        <w:ind w:left="4320" w:hanging="360"/>
+      </w:pPr>
+      <w:rPr>
+        <w:rFonts w:ascii="Wingdings" w:hAnsi="Wingdings" w:hint="default"/>
+        <w:sz w:val="20"/>
+      </w:rPr>
+    </w:lvl>
+    <w:lvl w:ilvl="6" w:tentative="1">
+      <w:start w:val="1"/>
+      <w:numFmt w:val="bullet"/>
+      <w:lvlText w:val=""/>
+      <w:lvlJc w:val="left"/>
+      <w:pPr>
+        <w:tabs>
+          <w:tab w:val="num" w:pos="5040"/>
+        </w:tabs>
+        <w:ind w:left="5040" w:hanging="360"/>
+      </w:pPr>
+      <w:rPr>
+        <w:rFonts w:ascii="Wingdings" w:hAnsi="Wingdings" w:hint="default"/>
+        <w:sz w:val="20"/>
+      </w:rPr>
+    </w:lvl>
+    <w:lvl w:ilvl="7" w:tentative="1">
+      <w:start w:val="1"/>
+      <w:numFmt w:val="bullet"/>
+      <w:lvlText w:val=""/>
+      <w:lvlJc w:val="left"/>
+      <w:pPr>
+        <w:tabs>
+          <w:tab w:val="num" w:pos="5760"/>
+        </w:tabs>
+        <w:ind w:left="5760" w:hanging="360"/>
+      </w:pPr>
+      <w:rPr>
+        <w:rFonts w:ascii="Wingdings" w:hAnsi="Wingdings" w:hint="default"/>
+        <w:sz w:val="20"/>
+      </w:rPr>
+    </w:lvl>
+    <w:lvl w:ilvl="8" w:tentative="1">
+      <w:start w:val="1"/>
+      <w:numFmt w:val="bullet"/>
+      <w:lvlText w:val=""/>
+      <w:lvlJc w:val="left"/>
+      <w:pPr>
+        <w:tabs>
+          <w:tab w:val="num" w:pos="6480"/>
+        </w:tabs>
+        <w:ind w:left="6480" w:hanging="360"/>
+      </w:pPr>
+      <w:rPr>
+        <w:rFonts w:ascii="Wingdings" w:hAnsi="Wingdings" w:hint="default"/>
+        <w:sz w:val="20"/>
+      </w:rPr>
+    </w:lvl>
+  </w:abstractNum>
+  <w:abstractNum w:abstractNumId="8" w15:restartNumberingAfterBreak="0">
     <w:nsid w:val="322B56E0"/>
     <w:multiLevelType w:val="multilevel"/>
     <w:tmpl w:val="54523E92"/>
@@ -1547,7 +3222,7 @@
       </w:rPr>
     </w:lvl>
   </w:abstractNum>
-  <w:abstractNum w:abstractNumId="5" w15:restartNumberingAfterBreak="0">
+  <w:abstractNum w:abstractNumId="9" w15:restartNumberingAfterBreak="0">
     <w:nsid w:val="332D102B"/>
     <w:multiLevelType w:val="multilevel"/>
     <w:tmpl w:val="FE40A280"/>
@@ -1696,7 +3371,454 @@
       </w:rPr>
     </w:lvl>
   </w:abstractNum>
-  <w:abstractNum w:abstractNumId="6" w15:restartNumberingAfterBreak="0">
+  <w:abstractNum w:abstractNumId="10" w15:restartNumberingAfterBreak="0">
+    <w:nsid w:val="3BED3E99"/>
+    <w:multiLevelType w:val="multilevel"/>
+    <w:tmpl w:val="5B02BE3E"/>
+    <w:lvl w:ilvl="0">
+      <w:start w:val="1"/>
+      <w:numFmt w:val="bullet"/>
+      <w:lvlText w:val=""/>
+      <w:lvlJc w:val="left"/>
+      <w:pPr>
+        <w:tabs>
+          <w:tab w:val="num" w:pos="720"/>
+        </w:tabs>
+        <w:ind w:left="720" w:hanging="360"/>
+      </w:pPr>
+      <w:rPr>
+        <w:rFonts w:ascii="Symbol" w:hAnsi="Symbol" w:hint="default"/>
+        <w:sz w:val="20"/>
+      </w:rPr>
+    </w:lvl>
+    <w:lvl w:ilvl="1">
+      <w:start w:val="1"/>
+      <w:numFmt w:val="bullet"/>
+      <w:lvlText w:val="o"/>
+      <w:lvlJc w:val="left"/>
+      <w:pPr>
+        <w:tabs>
+          <w:tab w:val="num" w:pos="1440"/>
+        </w:tabs>
+        <w:ind w:left="1440" w:hanging="360"/>
+      </w:pPr>
+      <w:rPr>
+        <w:rFonts w:ascii="Courier New" w:hAnsi="Courier New" w:hint="default"/>
+        <w:sz w:val="20"/>
+      </w:rPr>
+    </w:lvl>
+    <w:lvl w:ilvl="2" w:tentative="1">
+      <w:start w:val="1"/>
+      <w:numFmt w:val="bullet"/>
+      <w:lvlText w:val=""/>
+      <w:lvlJc w:val="left"/>
+      <w:pPr>
+        <w:tabs>
+          <w:tab w:val="num" w:pos="2160"/>
+        </w:tabs>
+        <w:ind w:left="2160" w:hanging="360"/>
+      </w:pPr>
+      <w:rPr>
+        <w:rFonts w:ascii="Wingdings" w:hAnsi="Wingdings" w:hint="default"/>
+        <w:sz w:val="20"/>
+      </w:rPr>
+    </w:lvl>
+    <w:lvl w:ilvl="3" w:tentative="1">
+      <w:start w:val="1"/>
+      <w:numFmt w:val="bullet"/>
+      <w:lvlText w:val=""/>
+      <w:lvlJc w:val="left"/>
+      <w:pPr>
+        <w:tabs>
+          <w:tab w:val="num" w:pos="2880"/>
+        </w:tabs>
+        <w:ind w:left="2880" w:hanging="360"/>
+      </w:pPr>
+      <w:rPr>
+        <w:rFonts w:ascii="Wingdings" w:hAnsi="Wingdings" w:hint="default"/>
+        <w:sz w:val="20"/>
+      </w:rPr>
+    </w:lvl>
+    <w:lvl w:ilvl="4" w:tentative="1">
+      <w:start w:val="1"/>
+      <w:numFmt w:val="bullet"/>
+      <w:lvlText w:val=""/>
+      <w:lvlJc w:val="left"/>
+      <w:pPr>
+        <w:tabs>
+          <w:tab w:val="num" w:pos="3600"/>
+        </w:tabs>
+        <w:ind w:left="3600" w:hanging="360"/>
+      </w:pPr>
+      <w:rPr>
+        <w:rFonts w:ascii="Wingdings" w:hAnsi="Wingdings" w:hint="default"/>
+        <w:sz w:val="20"/>
+      </w:rPr>
+    </w:lvl>
+    <w:lvl w:ilvl="5" w:tentative="1">
+      <w:start w:val="1"/>
+      <w:numFmt w:val="bullet"/>
+      <w:lvlText w:val=""/>
+      <w:lvlJc w:val="left"/>
+      <w:pPr>
+        <w:tabs>
+          <w:tab w:val="num" w:pos="4320"/>
+        </w:tabs>
+        <w:ind w:left="4320" w:hanging="360"/>
+      </w:pPr>
+      <w:rPr>
+        <w:rFonts w:ascii="Wingdings" w:hAnsi="Wingdings" w:hint="default"/>
+        <w:sz w:val="20"/>
+      </w:rPr>
+    </w:lvl>
+    <w:lvl w:ilvl="6" w:tentative="1">
+      <w:start w:val="1"/>
+      <w:numFmt w:val="bullet"/>
+      <w:lvlText w:val=""/>
+      <w:lvlJc w:val="left"/>
+      <w:pPr>
+        <w:tabs>
+          <w:tab w:val="num" w:pos="5040"/>
+        </w:tabs>
+        <w:ind w:left="5040" w:hanging="360"/>
+      </w:pPr>
+      <w:rPr>
+        <w:rFonts w:ascii="Wingdings" w:hAnsi="Wingdings" w:hint="default"/>
+        <w:sz w:val="20"/>
+      </w:rPr>
+    </w:lvl>
+    <w:lvl w:ilvl="7" w:tentative="1">
+      <w:start w:val="1"/>
+      <w:numFmt w:val="bullet"/>
+      <w:lvlText w:val=""/>
+      <w:lvlJc w:val="left"/>
+      <w:pPr>
+        <w:tabs>
+          <w:tab w:val="num" w:pos="5760"/>
+        </w:tabs>
+        <w:ind w:left="5760" w:hanging="360"/>
+      </w:pPr>
+      <w:rPr>
+        <w:rFonts w:ascii="Wingdings" w:hAnsi="Wingdings" w:hint="default"/>
+        <w:sz w:val="20"/>
+      </w:rPr>
+    </w:lvl>
+    <w:lvl w:ilvl="8" w:tentative="1">
+      <w:start w:val="1"/>
+      <w:numFmt w:val="bullet"/>
+      <w:lvlText w:val=""/>
+      <w:lvlJc w:val="left"/>
+      <w:pPr>
+        <w:tabs>
+          <w:tab w:val="num" w:pos="6480"/>
+        </w:tabs>
+        <w:ind w:left="6480" w:hanging="360"/>
+      </w:pPr>
+      <w:rPr>
+        <w:rFonts w:ascii="Wingdings" w:hAnsi="Wingdings" w:hint="default"/>
+        <w:sz w:val="20"/>
+      </w:rPr>
+    </w:lvl>
+  </w:abstractNum>
+  <w:abstractNum w:abstractNumId="11" w15:restartNumberingAfterBreak="0">
+    <w:nsid w:val="3DB33973"/>
+    <w:multiLevelType w:val="multilevel"/>
+    <w:tmpl w:val="76A04D08"/>
+    <w:lvl w:ilvl="0">
+      <w:start w:val="1"/>
+      <w:numFmt w:val="bullet"/>
+      <w:lvlText w:val=""/>
+      <w:lvlJc w:val="left"/>
+      <w:pPr>
+        <w:tabs>
+          <w:tab w:val="num" w:pos="720"/>
+        </w:tabs>
+        <w:ind w:left="720" w:hanging="360"/>
+      </w:pPr>
+      <w:rPr>
+        <w:rFonts w:ascii="Symbol" w:hAnsi="Symbol" w:hint="default"/>
+        <w:sz w:val="20"/>
+      </w:rPr>
+    </w:lvl>
+    <w:lvl w:ilvl="1" w:tentative="1">
+      <w:start w:val="1"/>
+      <w:numFmt w:val="bullet"/>
+      <w:lvlText w:val="o"/>
+      <w:lvlJc w:val="left"/>
+      <w:pPr>
+        <w:tabs>
+          <w:tab w:val="num" w:pos="1440"/>
+        </w:tabs>
+        <w:ind w:left="1440" w:hanging="360"/>
+      </w:pPr>
+      <w:rPr>
+        <w:rFonts w:ascii="Courier New" w:hAnsi="Courier New" w:hint="default"/>
+        <w:sz w:val="20"/>
+      </w:rPr>
+    </w:lvl>
+    <w:lvl w:ilvl="2" w:tentative="1">
+      <w:start w:val="1"/>
+      <w:numFmt w:val="bullet"/>
+      <w:lvlText w:val=""/>
+      <w:lvlJc w:val="left"/>
+      <w:pPr>
+        <w:tabs>
+          <w:tab w:val="num" w:pos="2160"/>
+        </w:tabs>
+        <w:ind w:left="2160" w:hanging="360"/>
+      </w:pPr>
+      <w:rPr>
+        <w:rFonts w:ascii="Wingdings" w:hAnsi="Wingdings" w:hint="default"/>
+        <w:sz w:val="20"/>
+      </w:rPr>
+    </w:lvl>
+    <w:lvl w:ilvl="3" w:tentative="1">
+      <w:start w:val="1"/>
+      <w:numFmt w:val="bullet"/>
+      <w:lvlText w:val=""/>
+      <w:lvlJc w:val="left"/>
+      <w:pPr>
+        <w:tabs>
+          <w:tab w:val="num" w:pos="2880"/>
+        </w:tabs>
+        <w:ind w:left="2880" w:hanging="360"/>
+      </w:pPr>
+      <w:rPr>
+        <w:rFonts w:ascii="Wingdings" w:hAnsi="Wingdings" w:hint="default"/>
+        <w:sz w:val="20"/>
+      </w:rPr>
+    </w:lvl>
+    <w:lvl w:ilvl="4" w:tentative="1">
+      <w:start w:val="1"/>
+      <w:numFmt w:val="bullet"/>
+      <w:lvlText w:val=""/>
+      <w:lvlJc w:val="left"/>
+      <w:pPr>
+        <w:tabs>
+          <w:tab w:val="num" w:pos="3600"/>
+        </w:tabs>
+        <w:ind w:left="3600" w:hanging="360"/>
+      </w:pPr>
+      <w:rPr>
+        <w:rFonts w:ascii="Wingdings" w:hAnsi="Wingdings" w:hint="default"/>
+        <w:sz w:val="20"/>
+      </w:rPr>
+    </w:lvl>
+    <w:lvl w:ilvl="5" w:tentative="1">
+      <w:start w:val="1"/>
+      <w:numFmt w:val="bullet"/>
+      <w:lvlText w:val=""/>
+      <w:lvlJc w:val="left"/>
+      <w:pPr>
+        <w:tabs>
+          <w:tab w:val="num" w:pos="4320"/>
+        </w:tabs>
+        <w:ind w:left="4320" w:hanging="360"/>
+      </w:pPr>
+      <w:rPr>
+        <w:rFonts w:ascii="Wingdings" w:hAnsi="Wingdings" w:hint="default"/>
+        <w:sz w:val="20"/>
+      </w:rPr>
+    </w:lvl>
+    <w:lvl w:ilvl="6" w:tentative="1">
+      <w:start w:val="1"/>
+      <w:numFmt w:val="bullet"/>
+      <w:lvlText w:val=""/>
+      <w:lvlJc w:val="left"/>
+      <w:pPr>
+        <w:tabs>
+          <w:tab w:val="num" w:pos="5040"/>
+        </w:tabs>
+        <w:ind w:left="5040" w:hanging="360"/>
+      </w:pPr>
+      <w:rPr>
+        <w:rFonts w:ascii="Wingdings" w:hAnsi="Wingdings" w:hint="default"/>
+        <w:sz w:val="20"/>
+      </w:rPr>
+    </w:lvl>
+    <w:lvl w:ilvl="7" w:tentative="1">
+      <w:start w:val="1"/>
+      <w:numFmt w:val="bullet"/>
+      <w:lvlText w:val=""/>
+      <w:lvlJc w:val="left"/>
+      <w:pPr>
+        <w:tabs>
+          <w:tab w:val="num" w:pos="5760"/>
+        </w:tabs>
+        <w:ind w:left="5760" w:hanging="360"/>
+      </w:pPr>
+      <w:rPr>
+        <w:rFonts w:ascii="Wingdings" w:hAnsi="Wingdings" w:hint="default"/>
+        <w:sz w:val="20"/>
+      </w:rPr>
+    </w:lvl>
+    <w:lvl w:ilvl="8" w:tentative="1">
+      <w:start w:val="1"/>
+      <w:numFmt w:val="bullet"/>
+      <w:lvlText w:val=""/>
+      <w:lvlJc w:val="left"/>
+      <w:pPr>
+        <w:tabs>
+          <w:tab w:val="num" w:pos="6480"/>
+        </w:tabs>
+        <w:ind w:left="6480" w:hanging="360"/>
+      </w:pPr>
+      <w:rPr>
+        <w:rFonts w:ascii="Wingdings" w:hAnsi="Wingdings" w:hint="default"/>
+        <w:sz w:val="20"/>
+      </w:rPr>
+    </w:lvl>
+  </w:abstractNum>
+  <w:abstractNum w:abstractNumId="12" w15:restartNumberingAfterBreak="0">
+    <w:nsid w:val="52C35BCA"/>
+    <w:multiLevelType w:val="multilevel"/>
+    <w:tmpl w:val="45F401B6"/>
+    <w:lvl w:ilvl="0">
+      <w:start w:val="1"/>
+      <w:numFmt w:val="bullet"/>
+      <w:lvlText w:val=""/>
+      <w:lvlJc w:val="left"/>
+      <w:pPr>
+        <w:tabs>
+          <w:tab w:val="num" w:pos="720"/>
+        </w:tabs>
+        <w:ind w:left="720" w:hanging="360"/>
+      </w:pPr>
+      <w:rPr>
+        <w:rFonts w:ascii="Symbol" w:hAnsi="Symbol" w:hint="default"/>
+        <w:sz w:val="20"/>
+      </w:rPr>
+    </w:lvl>
+    <w:lvl w:ilvl="1">
+      <w:start w:val="1"/>
+      <w:numFmt w:val="bullet"/>
+      <w:lvlText w:val="o"/>
+      <w:lvlJc w:val="left"/>
+      <w:pPr>
+        <w:tabs>
+          <w:tab w:val="num" w:pos="1440"/>
+        </w:tabs>
+        <w:ind w:left="1440" w:hanging="360"/>
+      </w:pPr>
+      <w:rPr>
+        <w:rFonts w:ascii="Courier New" w:hAnsi="Courier New" w:hint="default"/>
+        <w:sz w:val="20"/>
+      </w:rPr>
+    </w:lvl>
+    <w:lvl w:ilvl="2" w:tentative="1">
+      <w:start w:val="1"/>
+      <w:numFmt w:val="bullet"/>
+      <w:lvlText w:val=""/>
+      <w:lvlJc w:val="left"/>
+      <w:pPr>
+        <w:tabs>
+          <w:tab w:val="num" w:pos="2160"/>
+        </w:tabs>
+        <w:ind w:left="2160" w:hanging="360"/>
+      </w:pPr>
+      <w:rPr>
+        <w:rFonts w:ascii="Wingdings" w:hAnsi="Wingdings" w:hint="default"/>
+        <w:sz w:val="20"/>
+      </w:rPr>
+    </w:lvl>
+    <w:lvl w:ilvl="3" w:tentative="1">
+      <w:start w:val="1"/>
+      <w:numFmt w:val="bullet"/>
+      <w:lvlText w:val=""/>
+      <w:lvlJc w:val="left"/>
+      <w:pPr>
+        <w:tabs>
+          <w:tab w:val="num" w:pos="2880"/>
+        </w:tabs>
+        <w:ind w:left="2880" w:hanging="360"/>
+      </w:pPr>
+      <w:rPr>
+        <w:rFonts w:ascii="Wingdings" w:hAnsi="Wingdings" w:hint="default"/>
+        <w:sz w:val="20"/>
+      </w:rPr>
+    </w:lvl>
+    <w:lvl w:ilvl="4" w:tentative="1">
+      <w:start w:val="1"/>
+      <w:numFmt w:val="bullet"/>
+      <w:lvlText w:val=""/>
+      <w:lvlJc w:val="left"/>
+      <w:pPr>
+        <w:tabs>
+          <w:tab w:val="num" w:pos="3600"/>
+        </w:tabs>
+        <w:ind w:left="3600" w:hanging="360"/>
+      </w:pPr>
+      <w:rPr>
+        <w:rFonts w:ascii="Wingdings" w:hAnsi="Wingdings" w:hint="default"/>
+        <w:sz w:val="20"/>
+      </w:rPr>
+    </w:lvl>
+    <w:lvl w:ilvl="5" w:tentative="1">
+      <w:start w:val="1"/>
+      <w:numFmt w:val="bullet"/>
+      <w:lvlText w:val=""/>
+      <w:lvlJc w:val="left"/>
+      <w:pPr>
+        <w:tabs>
+          <w:tab w:val="num" w:pos="4320"/>
+        </w:tabs>
+        <w:ind w:left="4320" w:hanging="360"/>
+      </w:pPr>
+      <w:rPr>
+        <w:rFonts w:ascii="Wingdings" w:hAnsi="Wingdings" w:hint="default"/>
+        <w:sz w:val="20"/>
+      </w:rPr>
+    </w:lvl>
+    <w:lvl w:ilvl="6" w:tentative="1">
+      <w:start w:val="1"/>
+      <w:numFmt w:val="bullet"/>
+      <w:lvlText w:val=""/>
+      <w:lvlJc w:val="left"/>
+      <w:pPr>
+        <w:tabs>
+          <w:tab w:val="num" w:pos="5040"/>
+        </w:tabs>
+        <w:ind w:left="5040" w:hanging="360"/>
+      </w:pPr>
+      <w:rPr>
+        <w:rFonts w:ascii="Wingdings" w:hAnsi="Wingdings" w:hint="default"/>
+        <w:sz w:val="20"/>
+      </w:rPr>
+    </w:lvl>
+    <w:lvl w:ilvl="7" w:tentative="1">
+      <w:start w:val="1"/>
+      <w:numFmt w:val="bullet"/>
+      <w:lvlText w:val=""/>
+      <w:lvlJc w:val="left"/>
+      <w:pPr>
+        <w:tabs>
+          <w:tab w:val="num" w:pos="5760"/>
+        </w:tabs>
+        <w:ind w:left="5760" w:hanging="360"/>
+      </w:pPr>
+      <w:rPr>
+        <w:rFonts w:ascii="Wingdings" w:hAnsi="Wingdings" w:hint="default"/>
+        <w:sz w:val="20"/>
+      </w:rPr>
+    </w:lvl>
+    <w:lvl w:ilvl="8" w:tentative="1">
+      <w:start w:val="1"/>
+      <w:numFmt w:val="bullet"/>
+      <w:lvlText w:val=""/>
+      <w:lvlJc w:val="left"/>
+      <w:pPr>
+        <w:tabs>
+          <w:tab w:val="num" w:pos="6480"/>
+        </w:tabs>
+        <w:ind w:left="6480" w:hanging="360"/>
+      </w:pPr>
+      <w:rPr>
+        <w:rFonts w:ascii="Wingdings" w:hAnsi="Wingdings" w:hint="default"/>
+        <w:sz w:val="20"/>
+      </w:rPr>
+    </w:lvl>
+  </w:abstractNum>
+  <w:abstractNum w:abstractNumId="13" w15:restartNumberingAfterBreak="0">
     <w:nsid w:val="52FC5BA1"/>
     <w:multiLevelType w:val="multilevel"/>
     <w:tmpl w:val="E6D4E8B2"/>
@@ -1845,7 +3967,273 @@
       </w:rPr>
     </w:lvl>
   </w:abstractNum>
-  <w:abstractNum w:abstractNumId="7" w15:restartNumberingAfterBreak="0">
+  <w:abstractNum w:abstractNumId="14" w15:restartNumberingAfterBreak="0">
+    <w:nsid w:val="53AC446F"/>
+    <w:multiLevelType w:val="multilevel"/>
+    <w:tmpl w:val="2424CA62"/>
+    <w:lvl w:ilvl="0">
+      <w:start w:val="1"/>
+      <w:numFmt w:val="decimal"/>
+      <w:lvlText w:val="%1."/>
+      <w:lvlJc w:val="left"/>
+      <w:pPr>
+        <w:tabs>
+          <w:tab w:val="num" w:pos="720"/>
+        </w:tabs>
+        <w:ind w:left="720" w:hanging="360"/>
+      </w:pPr>
+    </w:lvl>
+    <w:lvl w:ilvl="1">
+      <w:start w:val="1"/>
+      <w:numFmt w:val="bullet"/>
+      <w:lvlText w:val="o"/>
+      <w:lvlJc w:val="left"/>
+      <w:pPr>
+        <w:tabs>
+          <w:tab w:val="num" w:pos="1440"/>
+        </w:tabs>
+        <w:ind w:left="1440" w:hanging="360"/>
+      </w:pPr>
+      <w:rPr>
+        <w:rFonts w:ascii="Courier New" w:hAnsi="Courier New" w:hint="default"/>
+        <w:sz w:val="20"/>
+      </w:rPr>
+    </w:lvl>
+    <w:lvl w:ilvl="2" w:tentative="1">
+      <w:start w:val="1"/>
+      <w:numFmt w:val="decimal"/>
+      <w:lvlText w:val="%3."/>
+      <w:lvlJc w:val="left"/>
+      <w:pPr>
+        <w:tabs>
+          <w:tab w:val="num" w:pos="2160"/>
+        </w:tabs>
+        <w:ind w:left="2160" w:hanging="360"/>
+      </w:pPr>
+    </w:lvl>
+    <w:lvl w:ilvl="3" w:tentative="1">
+      <w:start w:val="1"/>
+      <w:numFmt w:val="decimal"/>
+      <w:lvlText w:val="%4."/>
+      <w:lvlJc w:val="left"/>
+      <w:pPr>
+        <w:tabs>
+          <w:tab w:val="num" w:pos="2880"/>
+        </w:tabs>
+        <w:ind w:left="2880" w:hanging="360"/>
+      </w:pPr>
+    </w:lvl>
+    <w:lvl w:ilvl="4" w:tentative="1">
+      <w:start w:val="1"/>
+      <w:numFmt w:val="decimal"/>
+      <w:lvlText w:val="%5."/>
+      <w:lvlJc w:val="left"/>
+      <w:pPr>
+        <w:tabs>
+          <w:tab w:val="num" w:pos="3600"/>
+        </w:tabs>
+        <w:ind w:left="3600" w:hanging="360"/>
+      </w:pPr>
+    </w:lvl>
+    <w:lvl w:ilvl="5" w:tentative="1">
+      <w:start w:val="1"/>
+      <w:numFmt w:val="decimal"/>
+      <w:lvlText w:val="%6."/>
+      <w:lvlJc w:val="left"/>
+      <w:pPr>
+        <w:tabs>
+          <w:tab w:val="num" w:pos="4320"/>
+        </w:tabs>
+        <w:ind w:left="4320" w:hanging="360"/>
+      </w:pPr>
+    </w:lvl>
+    <w:lvl w:ilvl="6" w:tentative="1">
+      <w:start w:val="1"/>
+      <w:numFmt w:val="decimal"/>
+      <w:lvlText w:val="%7."/>
+      <w:lvlJc w:val="left"/>
+      <w:pPr>
+        <w:tabs>
+          <w:tab w:val="num" w:pos="5040"/>
+        </w:tabs>
+        <w:ind w:left="5040" w:hanging="360"/>
+      </w:pPr>
+    </w:lvl>
+    <w:lvl w:ilvl="7" w:tentative="1">
+      <w:start w:val="1"/>
+      <w:numFmt w:val="decimal"/>
+      <w:lvlText w:val="%8."/>
+      <w:lvlJc w:val="left"/>
+      <w:pPr>
+        <w:tabs>
+          <w:tab w:val="num" w:pos="5760"/>
+        </w:tabs>
+        <w:ind w:left="5760" w:hanging="360"/>
+      </w:pPr>
+    </w:lvl>
+    <w:lvl w:ilvl="8" w:tentative="1">
+      <w:start w:val="1"/>
+      <w:numFmt w:val="decimal"/>
+      <w:lvlText w:val="%9."/>
+      <w:lvlJc w:val="left"/>
+      <w:pPr>
+        <w:tabs>
+          <w:tab w:val="num" w:pos="6480"/>
+        </w:tabs>
+        <w:ind w:left="6480" w:hanging="360"/>
+      </w:pPr>
+    </w:lvl>
+  </w:abstractNum>
+  <w:abstractNum w:abstractNumId="15" w15:restartNumberingAfterBreak="0">
+    <w:nsid w:val="5FCA17E3"/>
+    <w:multiLevelType w:val="multilevel"/>
+    <w:tmpl w:val="326EFDEE"/>
+    <w:lvl w:ilvl="0">
+      <w:start w:val="1"/>
+      <w:numFmt w:val="bullet"/>
+      <w:lvlText w:val=""/>
+      <w:lvlJc w:val="left"/>
+      <w:pPr>
+        <w:tabs>
+          <w:tab w:val="num" w:pos="720"/>
+        </w:tabs>
+        <w:ind w:left="720" w:hanging="360"/>
+      </w:pPr>
+      <w:rPr>
+        <w:rFonts w:ascii="Symbol" w:hAnsi="Symbol" w:hint="default"/>
+        <w:sz w:val="20"/>
+      </w:rPr>
+    </w:lvl>
+    <w:lvl w:ilvl="1" w:tentative="1">
+      <w:start w:val="1"/>
+      <w:numFmt w:val="bullet"/>
+      <w:lvlText w:val="o"/>
+      <w:lvlJc w:val="left"/>
+      <w:pPr>
+        <w:tabs>
+          <w:tab w:val="num" w:pos="1440"/>
+        </w:tabs>
+        <w:ind w:left="1440" w:hanging="360"/>
+      </w:pPr>
+      <w:rPr>
+        <w:rFonts w:ascii="Courier New" w:hAnsi="Courier New" w:hint="default"/>
+        <w:sz w:val="20"/>
+      </w:rPr>
+    </w:lvl>
+    <w:lvl w:ilvl="2" w:tentative="1">
+      <w:start w:val="1"/>
+      <w:numFmt w:val="bullet"/>
+      <w:lvlText w:val=""/>
+      <w:lvlJc w:val="left"/>
+      <w:pPr>
+        <w:tabs>
+          <w:tab w:val="num" w:pos="2160"/>
+        </w:tabs>
+        <w:ind w:left="2160" w:hanging="360"/>
+      </w:pPr>
+      <w:rPr>
+        <w:rFonts w:ascii="Wingdings" w:hAnsi="Wingdings" w:hint="default"/>
+        <w:sz w:val="20"/>
+      </w:rPr>
+    </w:lvl>
+    <w:lvl w:ilvl="3" w:tentative="1">
+      <w:start w:val="1"/>
+      <w:numFmt w:val="bullet"/>
+      <w:lvlText w:val=""/>
+      <w:lvlJc w:val="left"/>
+      <w:pPr>
+        <w:tabs>
+          <w:tab w:val="num" w:pos="2880"/>
+        </w:tabs>
+        <w:ind w:left="2880" w:hanging="360"/>
+      </w:pPr>
+      <w:rPr>
+        <w:rFonts w:ascii="Wingdings" w:hAnsi="Wingdings" w:hint="default"/>
+        <w:sz w:val="20"/>
+      </w:rPr>
+    </w:lvl>
+    <w:lvl w:ilvl="4" w:tentative="1">
+      <w:start w:val="1"/>
+      <w:numFmt w:val="bullet"/>
+      <w:lvlText w:val=""/>
+      <w:lvlJc w:val="left"/>
+      <w:pPr>
+        <w:tabs>
+          <w:tab w:val="num" w:pos="3600"/>
+        </w:tabs>
+        <w:ind w:left="3600" w:hanging="360"/>
+      </w:pPr>
+      <w:rPr>
+        <w:rFonts w:ascii="Wingdings" w:hAnsi="Wingdings" w:hint="default"/>
+        <w:sz w:val="20"/>
+      </w:rPr>
+    </w:lvl>
+    <w:lvl w:ilvl="5" w:tentative="1">
+      <w:start w:val="1"/>
+      <w:numFmt w:val="bullet"/>
+      <w:lvlText w:val=""/>
+      <w:lvlJc w:val="left"/>
+      <w:pPr>
+        <w:tabs>
+          <w:tab w:val="num" w:pos="4320"/>
+        </w:tabs>
+        <w:ind w:left="4320" w:hanging="360"/>
+      </w:pPr>
+      <w:rPr>
+        <w:rFonts w:ascii="Wingdings" w:hAnsi="Wingdings" w:hint="default"/>
+        <w:sz w:val="20"/>
+      </w:rPr>
+    </w:lvl>
+    <w:lvl w:ilvl="6" w:tentative="1">
+      <w:start w:val="1"/>
+      <w:numFmt w:val="bullet"/>
+      <w:lvlText w:val=""/>
+      <w:lvlJc w:val="left"/>
+      <w:pPr>
+        <w:tabs>
+          <w:tab w:val="num" w:pos="5040"/>
+        </w:tabs>
+        <w:ind w:left="5040" w:hanging="360"/>
+      </w:pPr>
+      <w:rPr>
+        <w:rFonts w:ascii="Wingdings" w:hAnsi="Wingdings" w:hint="default"/>
+        <w:sz w:val="20"/>
+      </w:rPr>
+    </w:lvl>
+    <w:lvl w:ilvl="7" w:tentative="1">
+      <w:start w:val="1"/>
+      <w:numFmt w:val="bullet"/>
+      <w:lvlText w:val=""/>
+      <w:lvlJc w:val="left"/>
+      <w:pPr>
+        <w:tabs>
+          <w:tab w:val="num" w:pos="5760"/>
+        </w:tabs>
+        <w:ind w:left="5760" w:hanging="360"/>
+      </w:pPr>
+      <w:rPr>
+        <w:rFonts w:ascii="Wingdings" w:hAnsi="Wingdings" w:hint="default"/>
+        <w:sz w:val="20"/>
+      </w:rPr>
+    </w:lvl>
+    <w:lvl w:ilvl="8" w:tentative="1">
+      <w:start w:val="1"/>
+      <w:numFmt w:val="bullet"/>
+      <w:lvlText w:val=""/>
+      <w:lvlJc w:val="left"/>
+      <w:pPr>
+        <w:tabs>
+          <w:tab w:val="num" w:pos="6480"/>
+        </w:tabs>
+        <w:ind w:left="6480" w:hanging="360"/>
+      </w:pPr>
+      <w:rPr>
+        <w:rFonts w:ascii="Wingdings" w:hAnsi="Wingdings" w:hint="default"/>
+        <w:sz w:val="20"/>
+      </w:rPr>
+    </w:lvl>
+  </w:abstractNum>
+  <w:abstractNum w:abstractNumId="16" w15:restartNumberingAfterBreak="0">
     <w:nsid w:val="669D5356"/>
     <w:multiLevelType w:val="multilevel"/>
     <w:tmpl w:val="C0A2B5D2"/>
@@ -1994,7 +4382,7 @@
       </w:rPr>
     </w:lvl>
   </w:abstractNum>
-  <w:abstractNum w:abstractNumId="8" w15:restartNumberingAfterBreak="0">
+  <w:abstractNum w:abstractNumId="17" w15:restartNumberingAfterBreak="0">
     <w:nsid w:val="679351D7"/>
     <w:multiLevelType w:val="multilevel"/>
     <w:tmpl w:val="BBF06110"/>
@@ -2143,7 +4531,7 @@
       </w:rPr>
     </w:lvl>
   </w:abstractNum>
-  <w:abstractNum w:abstractNumId="9" w15:restartNumberingAfterBreak="0">
+  <w:abstractNum w:abstractNumId="18" w15:restartNumberingAfterBreak="0">
     <w:nsid w:val="6AD42158"/>
     <w:multiLevelType w:val="multilevel"/>
     <w:tmpl w:val="B9407854"/>
@@ -2292,7 +4680,7 @@
       </w:rPr>
     </w:lvl>
   </w:abstractNum>
-  <w:abstractNum w:abstractNumId="10" w15:restartNumberingAfterBreak="0">
+  <w:abstractNum w:abstractNumId="19" w15:restartNumberingAfterBreak="0">
     <w:nsid w:val="703F6245"/>
     <w:multiLevelType w:val="multilevel"/>
     <w:tmpl w:val="7D128D52"/>
@@ -2441,38 +4829,185 @@
       </w:rPr>
     </w:lvl>
   </w:abstractNum>
+  <w:abstractNum w:abstractNumId="20" w15:restartNumberingAfterBreak="0">
+    <w:nsid w:val="7B1A7183"/>
+    <w:multiLevelType w:val="multilevel"/>
+    <w:tmpl w:val="1A7C76BE"/>
+    <w:lvl w:ilvl="0">
+      <w:start w:val="1"/>
+      <w:numFmt w:val="decimal"/>
+      <w:lvlText w:val="%1."/>
+      <w:lvlJc w:val="left"/>
+      <w:pPr>
+        <w:tabs>
+          <w:tab w:val="num" w:pos="720"/>
+        </w:tabs>
+        <w:ind w:left="720" w:hanging="360"/>
+      </w:pPr>
+    </w:lvl>
+    <w:lvl w:ilvl="1">
+      <w:start w:val="1"/>
+      <w:numFmt w:val="bullet"/>
+      <w:lvlText w:val="o"/>
+      <w:lvlJc w:val="left"/>
+      <w:pPr>
+        <w:tabs>
+          <w:tab w:val="num" w:pos="1440"/>
+        </w:tabs>
+        <w:ind w:left="1440" w:hanging="360"/>
+      </w:pPr>
+      <w:rPr>
+        <w:rFonts w:ascii="Courier New" w:hAnsi="Courier New" w:hint="default"/>
+        <w:sz w:val="20"/>
+      </w:rPr>
+    </w:lvl>
+    <w:lvl w:ilvl="2" w:tentative="1">
+      <w:start w:val="1"/>
+      <w:numFmt w:val="decimal"/>
+      <w:lvlText w:val="%3."/>
+      <w:lvlJc w:val="left"/>
+      <w:pPr>
+        <w:tabs>
+          <w:tab w:val="num" w:pos="2160"/>
+        </w:tabs>
+        <w:ind w:left="2160" w:hanging="360"/>
+      </w:pPr>
+    </w:lvl>
+    <w:lvl w:ilvl="3" w:tentative="1">
+      <w:start w:val="1"/>
+      <w:numFmt w:val="decimal"/>
+      <w:lvlText w:val="%4."/>
+      <w:lvlJc w:val="left"/>
+      <w:pPr>
+        <w:tabs>
+          <w:tab w:val="num" w:pos="2880"/>
+        </w:tabs>
+        <w:ind w:left="2880" w:hanging="360"/>
+      </w:pPr>
+    </w:lvl>
+    <w:lvl w:ilvl="4" w:tentative="1">
+      <w:start w:val="1"/>
+      <w:numFmt w:val="decimal"/>
+      <w:lvlText w:val="%5."/>
+      <w:lvlJc w:val="left"/>
+      <w:pPr>
+        <w:tabs>
+          <w:tab w:val="num" w:pos="3600"/>
+        </w:tabs>
+        <w:ind w:left="3600" w:hanging="360"/>
+      </w:pPr>
+    </w:lvl>
+    <w:lvl w:ilvl="5" w:tentative="1">
+      <w:start w:val="1"/>
+      <w:numFmt w:val="decimal"/>
+      <w:lvlText w:val="%6."/>
+      <w:lvlJc w:val="left"/>
+      <w:pPr>
+        <w:tabs>
+          <w:tab w:val="num" w:pos="4320"/>
+        </w:tabs>
+        <w:ind w:left="4320" w:hanging="360"/>
+      </w:pPr>
+    </w:lvl>
+    <w:lvl w:ilvl="6" w:tentative="1">
+      <w:start w:val="1"/>
+      <w:numFmt w:val="decimal"/>
+      <w:lvlText w:val="%7."/>
+      <w:lvlJc w:val="left"/>
+      <w:pPr>
+        <w:tabs>
+          <w:tab w:val="num" w:pos="5040"/>
+        </w:tabs>
+        <w:ind w:left="5040" w:hanging="360"/>
+      </w:pPr>
+    </w:lvl>
+    <w:lvl w:ilvl="7" w:tentative="1">
+      <w:start w:val="1"/>
+      <w:numFmt w:val="decimal"/>
+      <w:lvlText w:val="%8."/>
+      <w:lvlJc w:val="left"/>
+      <w:pPr>
+        <w:tabs>
+          <w:tab w:val="num" w:pos="5760"/>
+        </w:tabs>
+        <w:ind w:left="5760" w:hanging="360"/>
+      </w:pPr>
+    </w:lvl>
+    <w:lvl w:ilvl="8" w:tentative="1">
+      <w:start w:val="1"/>
+      <w:numFmt w:val="decimal"/>
+      <w:lvlText w:val="%9."/>
+      <w:lvlJc w:val="left"/>
+      <w:pPr>
+        <w:tabs>
+          <w:tab w:val="num" w:pos="6480"/>
+        </w:tabs>
+        <w:ind w:left="6480" w:hanging="360"/>
+      </w:pPr>
+    </w:lvl>
+  </w:abstractNum>
   <w:num w:numId="1" w16cid:durableId="328212877">
+    <w:abstractNumId w:val="17"/>
+  </w:num>
+  <w:num w:numId="2" w16cid:durableId="1419063126">
+    <w:abstractNumId w:val="13"/>
+  </w:num>
+  <w:num w:numId="3" w16cid:durableId="1352533327">
+    <w:abstractNumId w:val="6"/>
+  </w:num>
+  <w:num w:numId="4" w16cid:durableId="1403913331">
+    <w:abstractNumId w:val="16"/>
+  </w:num>
+  <w:num w:numId="5" w16cid:durableId="1541355046">
+    <w:abstractNumId w:val="18"/>
+  </w:num>
+  <w:num w:numId="6" w16cid:durableId="1206722172">
+    <w:abstractNumId w:val="5"/>
+  </w:num>
+  <w:num w:numId="7" w16cid:durableId="2092462572">
     <w:abstractNumId w:val="8"/>
   </w:num>
-  <w:num w:numId="2" w16cid:durableId="1419063126">
-    <w:abstractNumId w:val="6"/>
+  <w:num w:numId="8" w16cid:durableId="1000693225">
+    <w:abstractNumId w:val="9"/>
   </w:num>
-  <w:num w:numId="3" w16cid:durableId="1352533327">
+  <w:num w:numId="9" w16cid:durableId="271475755">
+    <w:abstractNumId w:val="19"/>
+  </w:num>
+  <w:num w:numId="10" w16cid:durableId="1640457539">
+    <w:abstractNumId w:val="1"/>
+  </w:num>
+  <w:num w:numId="11" w16cid:durableId="281229113">
+    <w:abstractNumId w:val="4"/>
+  </w:num>
+  <w:num w:numId="12" w16cid:durableId="99763482">
+    <w:abstractNumId w:val="12"/>
+  </w:num>
+  <w:num w:numId="13" w16cid:durableId="1819609568">
+    <w:abstractNumId w:val="10"/>
+  </w:num>
+  <w:num w:numId="14" w16cid:durableId="1562709459">
+    <w:abstractNumId w:val="2"/>
+  </w:num>
+  <w:num w:numId="15" w16cid:durableId="778835819">
+    <w:abstractNumId w:val="0"/>
+  </w:num>
+  <w:num w:numId="16" w16cid:durableId="715928086">
+    <w:abstractNumId w:val="7"/>
+  </w:num>
+  <w:num w:numId="17" w16cid:durableId="1144539723">
+    <w:abstractNumId w:val="11"/>
+  </w:num>
+  <w:num w:numId="18" w16cid:durableId="1354455391">
+    <w:abstractNumId w:val="14"/>
+  </w:num>
+  <w:num w:numId="19" w16cid:durableId="350186493">
+    <w:abstractNumId w:val="15"/>
+  </w:num>
+  <w:num w:numId="20" w16cid:durableId="1814524688">
     <w:abstractNumId w:val="3"/>
   </w:num>
-  <w:num w:numId="4" w16cid:durableId="1403913331">
-    <w:abstractNumId w:val="7"/>
-  </w:num>
-  <w:num w:numId="5" w16cid:durableId="1541355046">
-    <w:abstractNumId w:val="9"/>
-  </w:num>
-  <w:num w:numId="6" w16cid:durableId="1206722172">
-    <w:abstractNumId w:val="2"/>
-  </w:num>
-  <w:num w:numId="7" w16cid:durableId="2092462572">
-    <w:abstractNumId w:val="4"/>
-  </w:num>
-  <w:num w:numId="8" w16cid:durableId="1000693225">
-    <w:abstractNumId w:val="5"/>
-  </w:num>
-  <w:num w:numId="9" w16cid:durableId="271475755">
-    <w:abstractNumId w:val="10"/>
-  </w:num>
-  <w:num w:numId="10" w16cid:durableId="1640457539">
-    <w:abstractNumId w:val="0"/>
-  </w:num>
-  <w:num w:numId="11" w16cid:durableId="281229113">
-    <w:abstractNumId w:val="1"/>
+  <w:num w:numId="21" w16cid:durableId="1983457144">
+    <w:abstractNumId w:val="20"/>
   </w:num>
 </w:numbering>
 </file>

</xml_diff>